<commit_message>
fix: month name without year, 2-person form side by side on one A4 page
- Miesiąc: 'kwiecień' instead of 'kwiecień 2026'
- 2-person template: original layout preserved (2 columns, 1 landscape page)
- Tags with _2 suffix for second person

Co-Authored-By: Claude Opus 4.6 (1M context) <noreply@anthropic.com>
</commit_message>
<xml_diff>
--- a/mbr/templates/paliwo_master_2.docx
+++ b/mbr/templates/paliwo_master_2.docx
@@ -1297,6 +1297,1137 @@
       <w:pPr>
         <w:spacing w:after="0" w:line="240" w:lineRule="auto"/>
         <w:ind w:left="2268"/>
+        <w:jc w:val="center"/>
+        <w:rPr>
+          <w:rFonts w:ascii="Times New Roman" w:eastAsia="Times New Roman" w:hAnsi="Times New Roman"/>
+          <w:color w:val="0E0E0E"/>
+          <w:sz w:val="16"/>
+          <w:szCs w:val="16"/>
+          <w:lang w:eastAsia="pl-PL"/>
+        </w:rPr>
+      </w:pPr>
+      <w:r>
+        <w:rPr>
+          <w:rFonts w:ascii="Times New Roman" w:eastAsia="Times New Roman" w:hAnsi="Times New Roman"/>
+          <w:color w:val="0E0E0E"/>
+          <w:sz w:val="16"/>
+          <w:szCs w:val="16"/>
+          <w:lang w:eastAsia="pl-PL"/>
+        </w:rPr>
+        <w:t>(</w:t>
+      </w:r>
+      <w:r>
+        <w:rPr>
+          <w:rFonts w:ascii="Times New Roman" w:eastAsia="Times New Roman" w:hAnsi="Times New Roman"/>
+          <w:color w:val="0E0E0E"/>
+          <w:sz w:val="16"/>
+          <w:szCs w:val="16"/>
+          <w:lang w:eastAsia="pl-PL"/>
+        </w:rPr>
+        <w:t>data</w:t>
+      </w:r>
+      <w:r>
+        <w:rPr>
+          <w:rFonts w:ascii="Times New Roman" w:eastAsia="Times New Roman" w:hAnsi="Times New Roman"/>
+          <w:color w:val="0E0E0E"/>
+          <w:sz w:val="16"/>
+          <w:szCs w:val="16"/>
+          <w:lang w:eastAsia="pl-PL"/>
+        </w:rPr>
+        <w:t>)</w:t>
+      </w:r>
+      <w:r>
+        <w:rPr>
+          <w:rFonts w:ascii="Times New Roman" w:eastAsia="Times New Roman" w:hAnsi="Times New Roman"/>
+          <w:color w:val="0E0E0E"/>
+          <w:sz w:val="24"/>
+          <w:szCs w:val="24"/>
+          <w:lang w:eastAsia="pl-PL"/>
+        </w:rPr>
+        <w:tab/>
+      </w:r>
+      <w:r>
+        <w:rPr>
+          <w:rFonts w:ascii="Times New Roman" w:eastAsia="Times New Roman" w:hAnsi="Times New Roman"/>
+          <w:color w:val="0E0E0E"/>
+          <w:sz w:val="24"/>
+          <w:szCs w:val="24"/>
+          <w:lang w:eastAsia="pl-PL"/>
+        </w:rPr>
+        <w:tab/>
+      </w:r>
+      <w:r>
+        <w:rPr>
+          <w:rFonts w:ascii="Times New Roman" w:eastAsia="Times New Roman" w:hAnsi="Times New Roman"/>
+          <w:color w:val="0E0E0E"/>
+          <w:sz w:val="24"/>
+          <w:szCs w:val="24"/>
+          <w:lang w:eastAsia="pl-PL"/>
+        </w:rPr>
+        <w:tab/>
+      </w:r>
+      <w:r>
+        <w:rPr>
+          <w:rFonts w:ascii="Times New Roman" w:eastAsia="Times New Roman" w:hAnsi="Times New Roman"/>
+          <w:color w:val="0E0E0E"/>
+          <w:sz w:val="24"/>
+          <w:szCs w:val="24"/>
+          <w:lang w:eastAsia="pl-PL"/>
+        </w:rPr>
+        <w:tab/>
+      </w:r>
+      <w:r>
+        <w:rPr>
+          <w:rFonts w:ascii="Times New Roman" w:eastAsia="Times New Roman" w:hAnsi="Times New Roman"/>
+          <w:color w:val="0E0E0E"/>
+          <w:sz w:val="16"/>
+          <w:szCs w:val="16"/>
+          <w:lang w:eastAsia="pl-PL"/>
+        </w:rPr>
+        <w:t>(</w:t>
+      </w:r>
+      <w:r>
+        <w:rPr>
+          <w:rFonts w:ascii="Times New Roman" w:eastAsia="Times New Roman" w:hAnsi="Times New Roman"/>
+          <w:color w:val="0E0E0E"/>
+          <w:sz w:val="16"/>
+          <w:szCs w:val="16"/>
+          <w:lang w:eastAsia="pl-PL"/>
+        </w:rPr>
+        <w:t>podpis</w:t>
+      </w:r>
+      <w:r>
+        <w:rPr>
+          <w:rFonts w:ascii="Times New Roman" w:eastAsia="Times New Roman" w:hAnsi="Times New Roman"/>
+          <w:color w:val="0E0E0E"/>
+          <w:sz w:val="16"/>
+          <w:szCs w:val="16"/>
+          <w:lang w:eastAsia="pl-PL"/>
+        </w:rPr>
+        <w:t>)</w:t>
+      </w:r>
+    </w:p>
+    <w:p>
+      <w:pPr>
+        <w:spacing w:after="0" w:line="240" w:lineRule="auto"/>
+        <w:rPr>
+          <w:rFonts w:ascii="Arial" w:eastAsia="Times New Roman" w:hAnsi="Arial" w:cs="Arial"/>
+          <w:vanish/>
+          <w:sz w:val="16"/>
+          <w:szCs w:val="16"/>
+          <w:lang w:val="en-US" w:eastAsia="pl-PL"/>
+        </w:rPr>
+      </w:pPr>
+      <w:r>
+        <w:rPr>
+          <w:rFonts w:ascii="Times New Roman" w:eastAsia="Times New Roman" w:hAnsi="Times New Roman"/>
+          <w:color w:val="0E0E0E"/>
+          <w:sz w:val="24"/>
+          <w:szCs w:val="24"/>
+          <w:lang w:eastAsia="pl-PL"/>
+        </w:rPr>
+        <w:br/>
+      </w:r>
+      <w:r>
+        <w:rPr>
+          <w:rFonts w:ascii="Arial" w:eastAsia="Times New Roman" w:hAnsi="Arial" w:cs="Arial"/>
+          <w:vanish/>
+          <w:sz w:val="16"/>
+          <w:szCs w:val="16"/>
+          <w:lang w:val="en-US" w:eastAsia="pl-PL"/>
+        </w:rPr>
+        <w:br w:type="column"/>
+      </w:r>
+    </w:p>
+    <w:p>
+      <w:pPr>
+        <w:spacing w:after="0" w:line="240" w:lineRule="auto"/>
+        <w:jc w:val="right"/>
+        <w:rPr>
+          <w:rFonts w:ascii="Times New Roman" w:eastAsia="Times New Roman" w:hAnsi="Times New Roman"/>
+          <w:color w:val="0E0E0E"/>
+          <w:sz w:val="24"/>
+          <w:szCs w:val="24"/>
+          <w:lang w:eastAsia="pl-PL"/>
+        </w:rPr>
+      </w:pPr>
+      <w:r>
+        <w:rPr>
+          <w:rFonts w:ascii="Times New Roman" w:eastAsia="Times New Roman" w:hAnsi="Times New Roman"/>
+          <w:color w:val="0E0E0E"/>
+          <w:sz w:val="24"/>
+          <w:szCs w:val="24"/>
+          <w:lang w:eastAsia="pl-PL"/>
+        </w:rPr>
+        <w:t>{{imie_nazwisko_2}}</w:t>
+      </w:r>
+      <w:r>
+        <w:rPr>
+          <w:rFonts w:ascii="Times New Roman" w:eastAsia="Times New Roman" w:hAnsi="Times New Roman"/>
+          <w:color w:val="0E0E0E"/>
+          <w:sz w:val="24"/>
+          <w:szCs w:val="24"/>
+          <w:lang w:eastAsia="pl-PL"/>
+        </w:rPr>
+      </w:r>
+      <w:r>
+        <w:rPr>
+          <w:rFonts w:ascii="Times New Roman" w:eastAsia="Times New Roman" w:hAnsi="Times New Roman"/>
+          <w:color w:val="0E0E0E"/>
+          <w:sz w:val="24"/>
+          <w:szCs w:val="24"/>
+          <w:lang w:eastAsia="pl-PL"/>
+        </w:rPr>
+      </w:r>
+      <w:r>
+        <w:rPr>
+          <w:rFonts w:ascii="Times New Roman" w:eastAsia="Times New Roman" w:hAnsi="Times New Roman"/>
+          <w:color w:val="0E0E0E"/>
+          <w:sz w:val="24"/>
+          <w:szCs w:val="24"/>
+          <w:lang w:eastAsia="pl-PL"/>
+        </w:rPr>
+      </w:r>
+      <w:r>
+        <w:rPr>
+          <w:rFonts w:ascii="Times New Roman" w:eastAsia="Times New Roman" w:hAnsi="Times New Roman"/>
+          <w:color w:val="0E0E0E"/>
+          <w:sz w:val="24"/>
+          <w:szCs w:val="24"/>
+          <w:lang w:eastAsia="pl-PL"/>
+        </w:rPr>
+        <w:t>{{data_wystawienia_2}}</w:t>
+      </w:r>
+    </w:p>
+    <w:p>
+      <w:pPr>
+        <w:spacing w:after="0" w:line="240" w:lineRule="auto"/>
+        <w:rPr>
+          <w:rFonts w:ascii="Times New Roman" w:eastAsia="Times New Roman" w:hAnsi="Times New Roman"/>
+          <w:color w:val="0E0E0E"/>
+          <w:sz w:val="16"/>
+          <w:szCs w:val="16"/>
+          <w:lang w:eastAsia="pl-PL"/>
+        </w:rPr>
+      </w:pPr>
+      <w:r>
+        <w:rPr>
+          <w:rFonts w:ascii="Times New Roman" w:eastAsia="Times New Roman" w:hAnsi="Times New Roman"/>
+          <w:color w:val="0E0E0E"/>
+          <w:sz w:val="16"/>
+          <w:szCs w:val="16"/>
+          <w:lang w:eastAsia="pl-PL"/>
+        </w:rPr>
+        <w:t xml:space="preserve">              </w:t>
+      </w:r>
+      <w:r>
+        <w:rPr>
+          <w:rFonts w:ascii="Times New Roman" w:eastAsia="Times New Roman" w:hAnsi="Times New Roman"/>
+          <w:color w:val="0E0E0E"/>
+          <w:sz w:val="16"/>
+          <w:szCs w:val="16"/>
+          <w:lang w:eastAsia="pl-PL"/>
+        </w:rPr>
+        <w:t>(imię i nazwisko)</w:t>
+      </w:r>
+      <w:r>
+        <w:rPr>
+          <w:rFonts w:ascii="Times New Roman" w:eastAsia="Times New Roman" w:hAnsi="Times New Roman"/>
+          <w:color w:val="0E0E0E"/>
+          <w:sz w:val="16"/>
+          <w:szCs w:val="16"/>
+          <w:lang w:eastAsia="pl-PL"/>
+        </w:rPr>
+        <w:tab/>
+      </w:r>
+      <w:r>
+        <w:rPr>
+          <w:rFonts w:ascii="Times New Roman" w:eastAsia="Times New Roman" w:hAnsi="Times New Roman"/>
+          <w:color w:val="0E0E0E"/>
+          <w:sz w:val="16"/>
+          <w:szCs w:val="16"/>
+          <w:lang w:eastAsia="pl-PL"/>
+        </w:rPr>
+        <w:tab/>
+      </w:r>
+      <w:r>
+        <w:rPr>
+          <w:rFonts w:ascii="Times New Roman" w:eastAsia="Times New Roman" w:hAnsi="Times New Roman"/>
+          <w:color w:val="0E0E0E"/>
+          <w:sz w:val="16"/>
+          <w:szCs w:val="16"/>
+          <w:lang w:eastAsia="pl-PL"/>
+        </w:rPr>
+        <w:tab/>
+      </w:r>
+      <w:r>
+        <w:rPr>
+          <w:rFonts w:ascii="Times New Roman" w:eastAsia="Times New Roman" w:hAnsi="Times New Roman"/>
+          <w:color w:val="0E0E0E"/>
+          <w:sz w:val="16"/>
+          <w:szCs w:val="16"/>
+          <w:lang w:eastAsia="pl-PL"/>
+        </w:rPr>
+        <w:tab/>
+      </w:r>
+      <w:r>
+        <w:rPr>
+          <w:rFonts w:ascii="Times New Roman" w:eastAsia="Times New Roman" w:hAnsi="Times New Roman"/>
+          <w:color w:val="0E0E0E"/>
+          <w:sz w:val="16"/>
+          <w:szCs w:val="16"/>
+          <w:lang w:eastAsia="pl-PL"/>
+        </w:rPr>
+        <w:tab/>
+        <w:t>(data)</w:t>
+      </w:r>
+    </w:p>
+    <w:p>
+      <w:pPr>
+        <w:spacing w:before="240" w:after="0" w:line="240" w:lineRule="auto"/>
+        <w:rPr>
+          <w:rFonts w:ascii="Times New Roman" w:eastAsia="Times New Roman" w:hAnsi="Times New Roman"/>
+          <w:color w:val="0E0E0E"/>
+          <w:sz w:val="24"/>
+          <w:szCs w:val="24"/>
+          <w:lang w:eastAsia="pl-PL"/>
+        </w:rPr>
+      </w:pPr>
+      <w:r>
+        <w:rPr>
+          <w:rFonts w:ascii="Times New Roman" w:eastAsia="Times New Roman" w:hAnsi="Times New Roman"/>
+          <w:color w:val="0E0E0E"/>
+          <w:sz w:val="24"/>
+          <w:szCs w:val="24"/>
+          <w:lang w:eastAsia="pl-PL"/>
+        </w:rPr>
+        <w:t>{{stanowisko_2}}</w:t>
+      </w:r>
+    </w:p>
+    <w:p>
+      <w:pPr>
+        <w:spacing w:after="0" w:line="240" w:lineRule="auto"/>
+        <w:rPr>
+          <w:rFonts w:ascii="Times New Roman" w:eastAsia="Times New Roman" w:hAnsi="Times New Roman"/>
+          <w:color w:val="0E0E0E"/>
+          <w:sz w:val="16"/>
+          <w:szCs w:val="16"/>
+          <w:lang w:eastAsia="pl-PL"/>
+        </w:rPr>
+      </w:pPr>
+      <w:r>
+        <w:rPr>
+          <w:rFonts w:ascii="Times New Roman" w:eastAsia="Times New Roman" w:hAnsi="Times New Roman"/>
+          <w:color w:val="0E0E0E"/>
+          <w:sz w:val="16"/>
+          <w:szCs w:val="16"/>
+          <w:lang w:eastAsia="pl-PL"/>
+        </w:rPr>
+        <w:t xml:space="preserve">              (stanowisko służbowe</w:t>
+      </w:r>
+      <w:r>
+        <w:rPr>
+          <w:rFonts w:ascii="Times New Roman" w:eastAsia="Times New Roman" w:hAnsi="Times New Roman"/>
+          <w:color w:val="0E0E0E"/>
+          <w:sz w:val="16"/>
+          <w:szCs w:val="16"/>
+          <w:lang w:eastAsia="pl-PL"/>
+        </w:rPr>
+        <w:t>)</w:t>
+      </w:r>
+    </w:p>
+    <w:p>
+      <w:pPr>
+        <w:spacing w:after="0" w:line="240" w:lineRule="auto"/>
+        <w:rPr>
+          <w:rFonts w:ascii="Times New Roman" w:eastAsia="Times New Roman" w:hAnsi="Times New Roman"/>
+          <w:color w:val="0E0E0E"/>
+          <w:sz w:val="24"/>
+          <w:szCs w:val="24"/>
+          <w:lang w:eastAsia="pl-PL"/>
+        </w:rPr>
+      </w:pPr>
+    </w:p>
+    <w:p>
+      <w:pPr>
+        <w:spacing w:after="0" w:line="240" w:lineRule="auto"/>
+        <w:jc w:val="center"/>
+        <w:rPr>
+          <w:rFonts w:ascii="Times New Roman" w:eastAsia="Times New Roman" w:hAnsi="Times New Roman"/>
+          <w:color w:val="0E0E0E"/>
+          <w:sz w:val="32"/>
+          <w:szCs w:val="32"/>
+          <w:lang w:eastAsia="pl-PL"/>
+        </w:rPr>
+      </w:pPr>
+      <w:r>
+        <w:rPr>
+          <w:rFonts w:ascii="Times New Roman" w:eastAsia="Times New Roman" w:hAnsi="Times New Roman"/>
+          <w:b/>
+          <w:bCs/>
+          <w:sz w:val="32"/>
+          <w:szCs w:val="32"/>
+          <w:lang w:eastAsia="pl-PL"/>
+        </w:rPr>
+        <w:t xml:space="preserve">OŚWIADCZENIE </w:t>
+      </w:r>
+    </w:p>
+    <w:p>
+      <w:pPr>
+        <w:spacing w:after="0" w:line="240" w:lineRule="auto"/>
+        <w:rPr>
+          <w:rFonts w:ascii="Times New Roman" w:eastAsia="Times New Roman" w:hAnsi="Times New Roman"/>
+          <w:color w:val="0E0E0E"/>
+          <w:sz w:val="24"/>
+          <w:szCs w:val="24"/>
+          <w:lang w:eastAsia="pl-PL"/>
+        </w:rPr>
+      </w:pPr>
+    </w:p>
+    <w:p>
+      <w:pPr>
+        <w:spacing w:after="160" w:line="240" w:lineRule="auto"/>
+        <w:jc w:val="right"/>
+        <w:rPr>
+          <w:rFonts w:ascii="Times New Roman" w:eastAsia="Times New Roman" w:hAnsi="Times New Roman"/>
+          <w:color w:val="0E0E0E"/>
+          <w:sz w:val="24"/>
+          <w:szCs w:val="24"/>
+          <w:lang w:eastAsia="pl-PL"/>
+        </w:rPr>
+      </w:pPr>
+      <w:r>
+        <w:rPr>
+          <w:rFonts w:ascii="Times New Roman" w:eastAsia="Times New Roman" w:hAnsi="Times New Roman"/>
+          <w:b/>
+          <w:color w:val="0E0E0E"/>
+          <w:lang w:eastAsia="pl-PL"/>
+        </w:rPr>
+        <w:t>o używaniu własnego samochodu nr rej.: {{nr_rejestracyjny_2}}</w:t>
+      </w:r>
+      <w:r>
+        <w:rPr>
+          <w:rFonts w:ascii="Times New Roman" w:eastAsia="Times New Roman" w:hAnsi="Times New Roman"/>
+          <w:color w:val="0E0E0E"/>
+          <w:sz w:val="24"/>
+          <w:szCs w:val="24"/>
+          <w:lang w:eastAsia="pl-PL"/>
+        </w:rPr>
+      </w:r>
+    </w:p>
+    <w:p>
+      <w:pPr>
+        <w:spacing w:after="0" w:line="240" w:lineRule="auto"/>
+        <w:ind w:left="2126"/>
+        <w:jc w:val="right"/>
+        <w:rPr>
+          <w:rFonts w:ascii="Times New Roman" w:eastAsia="Times New Roman" w:hAnsi="Times New Roman"/>
+          <w:color w:val="0E0E0E"/>
+          <w:sz w:val="24"/>
+          <w:szCs w:val="24"/>
+          <w:lang w:eastAsia="pl-PL"/>
+        </w:rPr>
+      </w:pPr>
+      <w:r>
+        <w:rPr>
+          <w:rFonts w:ascii="Times New Roman" w:eastAsia="Times New Roman" w:hAnsi="Times New Roman"/>
+          <w:color w:val="0E0E0E"/>
+          <w:sz w:val="24"/>
+          <w:szCs w:val="24"/>
+          <w:lang w:eastAsia="pl-PL"/>
+        </w:rPr>
+        <w:t xml:space="preserve">           </w:t>
+      </w:r>
+      <w:r>
+        <w:rPr>
+          <w:rFonts w:ascii="Times New Roman" w:eastAsia="Times New Roman" w:hAnsi="Times New Roman"/>
+          <w:b/>
+          <w:color w:val="0E0E0E"/>
+          <w:lang w:eastAsia="pl-PL"/>
+        </w:rPr>
+        <w:t>w miesiącu</w:t>
+      </w:r>
+      <w:r>
+        <w:rPr>
+          <w:rFonts w:ascii="Times New Roman" w:eastAsia="Times New Roman" w:hAnsi="Times New Roman"/>
+          <w:color w:val="0E0E0E"/>
+          <w:sz w:val="24"/>
+          <w:szCs w:val="24"/>
+          <w:lang w:eastAsia="pl-PL"/>
+        </w:rPr>
+        <w:t>: {{miesiac_2}}</w:t>
+      </w:r>
+    </w:p>
+    <w:p>
+      <w:pPr>
+        <w:spacing w:after="0" w:line="240" w:lineRule="auto"/>
+        <w:ind w:left="2124"/>
+        <w:jc w:val="right"/>
+        <w:rPr>
+          <w:rFonts w:ascii="Times New Roman" w:eastAsia="Times New Roman" w:hAnsi="Times New Roman"/>
+          <w:color w:val="0E0E0E"/>
+          <w:sz w:val="24"/>
+          <w:szCs w:val="24"/>
+          <w:lang w:eastAsia="pl-PL"/>
+        </w:rPr>
+      </w:pPr>
+    </w:p>
+    <w:p>
+      <w:pPr>
+        <w:spacing w:after="0" w:line="240" w:lineRule="auto"/>
+        <w:ind w:firstLine="284"/>
+        <w:jc w:val="right"/>
+        <w:rPr>
+          <w:rFonts w:ascii="Times New Roman" w:eastAsia="Times New Roman" w:hAnsi="Times New Roman"/>
+          <w:color w:val="0E0E0E"/>
+          <w:sz w:val="20"/>
+          <w:szCs w:val="20"/>
+          <w:lang w:eastAsia="pl-PL"/>
+        </w:rPr>
+      </w:pPr>
+      <w:r>
+        <w:rPr>
+          <w:rFonts w:ascii="Times New Roman" w:eastAsia="Times New Roman" w:hAnsi="Times New Roman"/>
+          <w:color w:val="0E0E0E"/>
+          <w:sz w:val="20"/>
+          <w:szCs w:val="20"/>
+          <w:lang w:eastAsia="pl-PL"/>
+        </w:rPr>
+        <w:t>Oświadczam, że w oparciu o przyznany mi ryczałt za m-c: {{miesiac_ryczalt_2}}</w:t>
+      </w:r>
+      <w:r>
+        <w:rPr>
+          <w:rFonts w:ascii="Times New Roman" w:eastAsia="Times New Roman" w:hAnsi="Times New Roman"/>
+          <w:color w:val="0E0E0E"/>
+          <w:sz w:val="20"/>
+          <w:szCs w:val="20"/>
+          <w:lang w:eastAsia="pl-PL"/>
+        </w:rPr>
+      </w:r>
+      <w:r>
+        <w:rPr>
+          <w:rFonts w:ascii="Times New Roman" w:eastAsia="Times New Roman" w:hAnsi="Times New Roman"/>
+          <w:color w:val="0E0E0E"/>
+          <w:sz w:val="20"/>
+          <w:szCs w:val="20"/>
+          <w:lang w:eastAsia="pl-PL"/>
+        </w:rPr>
+      </w:r>
+      <w:r>
+        <w:rPr>
+          <w:rFonts w:ascii="Times New Roman" w:eastAsia="Times New Roman" w:hAnsi="Times New Roman"/>
+          <w:color w:val="0E0E0E"/>
+          <w:sz w:val="20"/>
+          <w:szCs w:val="20"/>
+          <w:lang w:eastAsia="pl-PL"/>
+        </w:rPr>
+      </w:r>
+      <w:r>
+        <w:rPr>
+          <w:rFonts w:ascii="Times New Roman" w:eastAsia="Times New Roman" w:hAnsi="Times New Roman"/>
+          <w:color w:val="0E0E0E"/>
+          <w:sz w:val="20"/>
+          <w:szCs w:val="20"/>
+          <w:lang w:eastAsia="pl-PL"/>
+        </w:rPr>
+      </w:r>
+      <w:r>
+        <w:rPr>
+          <w:rFonts w:ascii="Times New Roman" w:eastAsia="Times New Roman" w:hAnsi="Times New Roman"/>
+          <w:color w:val="0E0E0E"/>
+          <w:sz w:val="20"/>
+          <w:szCs w:val="20"/>
+          <w:lang w:eastAsia="pl-PL"/>
+        </w:rPr>
+      </w:r>
+    </w:p>
+    <w:p>
+      <w:pPr>
+        <w:spacing w:after="0" w:line="240" w:lineRule="auto"/>
+        <w:rPr>
+          <w:rFonts w:ascii="Times New Roman" w:eastAsia="Times New Roman" w:hAnsi="Times New Roman"/>
+          <w:color w:val="0E0E0E"/>
+          <w:sz w:val="20"/>
+          <w:szCs w:val="20"/>
+          <w:lang w:eastAsia="pl-PL"/>
+        </w:rPr>
+      </w:pPr>
+      <w:r>
+        <w:rPr>
+          <w:rFonts w:ascii="Times New Roman" w:eastAsia="Times New Roman" w:hAnsi="Times New Roman"/>
+          <w:color w:val="0E0E0E"/>
+          <w:sz w:val="20"/>
+          <w:szCs w:val="20"/>
+          <w:lang w:eastAsia="pl-PL"/>
+        </w:rPr>
+        <w:t>na {{limit_km_2}} km. używałem samochód prywatny do celów służbowych.</w:t>
+      </w:r>
+    </w:p>
+    <w:p>
+      <w:pPr>
+        <w:spacing w:after="0" w:line="240" w:lineRule="auto"/>
+        <w:jc w:val="right"/>
+        <w:rPr>
+          <w:rFonts w:ascii="Times New Roman" w:eastAsia="Times New Roman" w:hAnsi="Times New Roman"/>
+          <w:color w:val="0E0E0E"/>
+          <w:sz w:val="20"/>
+          <w:szCs w:val="20"/>
+          <w:lang w:eastAsia="pl-PL"/>
+        </w:rPr>
+      </w:pPr>
+      <w:r>
+        <w:rPr>
+          <w:rFonts w:ascii="Times New Roman" w:eastAsia="Times New Roman" w:hAnsi="Times New Roman"/>
+          <w:color w:val="0E0E0E"/>
+          <w:sz w:val="20"/>
+          <w:szCs w:val="20"/>
+          <w:lang w:eastAsia="pl-PL"/>
+        </w:rPr>
+        <w:t>Ryczałt wykorzystałem w kwocie:                         {{ryczalt_2}} zł</w:t>
+      </w:r>
+      <w:r>
+        <w:rPr>
+          <w:rFonts w:ascii="Times New Roman" w:eastAsia="Times New Roman" w:hAnsi="Times New Roman"/>
+          <w:color w:val="0E0E0E"/>
+          <w:sz w:val="20"/>
+          <w:szCs w:val="20"/>
+          <w:lang w:eastAsia="pl-PL"/>
+        </w:rPr>
+      </w:r>
+      <w:r>
+        <w:rPr>
+          <w:rFonts w:ascii="Times New Roman" w:eastAsia="Times New Roman" w:hAnsi="Times New Roman"/>
+          <w:color w:val="0E0E0E"/>
+          <w:sz w:val="20"/>
+          <w:szCs w:val="20"/>
+          <w:lang w:eastAsia="pl-PL"/>
+        </w:rPr>
+      </w:r>
+    </w:p>
+    <w:p>
+      <w:pPr>
+        <w:spacing w:before="240" w:after="240" w:line="240" w:lineRule="auto"/>
+        <w:rPr>
+          <w:rFonts w:ascii="Times New Roman" w:eastAsia="Times New Roman" w:hAnsi="Times New Roman"/>
+          <w:b/>
+          <w:color w:val="0E0E0E"/>
+          <w:sz w:val="24"/>
+          <w:szCs w:val="24"/>
+          <w:lang w:eastAsia="pl-PL"/>
+        </w:rPr>
+      </w:pPr>
+      <w:r>
+        <w:rPr>
+          <w:rFonts w:ascii="Times New Roman" w:eastAsia="Times New Roman" w:hAnsi="Times New Roman"/>
+          <w:b/>
+          <w:color w:val="0E0E0E"/>
+          <w:sz w:val="24"/>
+          <w:szCs w:val="24"/>
+          <w:lang w:eastAsia="pl-PL"/>
+        </w:rPr>
+        <w:t>Potrącenia:</w:t>
+      </w:r>
+    </w:p>
+    <w:p>
+      <w:pPr>
+        <w:spacing w:after="120" w:line="240" w:lineRule="auto"/>
+        <w:rPr>
+          <w:rFonts w:ascii="Times New Roman" w:eastAsia="Times New Roman" w:hAnsi="Times New Roman"/>
+          <w:color w:val="0E0E0E"/>
+          <w:sz w:val="18"/>
+          <w:szCs w:val="18"/>
+          <w:lang w:eastAsia="pl-PL"/>
+        </w:rPr>
+      </w:pPr>
+      <w:r>
+        <w:rPr>
+          <w:rFonts w:ascii="Times New Roman" w:eastAsia="Times New Roman" w:hAnsi="Times New Roman"/>
+          <w:color w:val="0E0E0E"/>
+          <w:sz w:val="18"/>
+          <w:szCs w:val="18"/>
+          <w:lang w:eastAsia="pl-PL"/>
+        </w:rPr>
+        <w:t>Za {{dni_urlopu_2}} dni urlopu wypoczynkowego (okolicznościowego,</w:t>
+        <w:br/>
+        <w:t>bezpłatnego), delegacji służbowej, z powodu choroby.</w:t>
+      </w:r>
+      <w:r>
+        <w:rPr>
+          <w:rFonts w:ascii="Times New Roman" w:eastAsia="Times New Roman" w:hAnsi="Times New Roman"/>
+          <w:color w:val="0E0E0E"/>
+          <w:sz w:val="18"/>
+          <w:szCs w:val="18"/>
+          <w:lang w:eastAsia="pl-PL"/>
+        </w:rPr>
+      </w:r>
+    </w:p>
+    <w:p>
+      <w:pPr>
+        <w:spacing w:after="0" w:line="360" w:lineRule="auto"/>
+        <w:ind w:firstLine="570"/>
+        <w:jc w:val="right"/>
+        <w:rPr>
+          <w:rFonts w:ascii="Times New Roman" w:eastAsia="Times New Roman" w:hAnsi="Times New Roman"/>
+          <w:color w:val="0E0E0E"/>
+          <w:sz w:val="20"/>
+          <w:szCs w:val="20"/>
+          <w:lang w:eastAsia="pl-PL"/>
+        </w:rPr>
+      </w:pPr>
+      <w:r>
+        <w:rPr>
+          <w:rFonts w:ascii="Times New Roman" w:eastAsia="Times New Roman" w:hAnsi="Times New Roman"/>
+          <w:color w:val="0E0E0E"/>
+          <w:sz w:val="18"/>
+          <w:szCs w:val="18"/>
+          <w:lang w:eastAsia="pl-PL"/>
+        </w:rPr>
+        <w:t>o 1/22 za każdy dzień j.w. po zł.:                           {{stawka_dzienna_2}} zł</w:t>
+      </w:r>
+      <w:proofErr w:type="spellStart"/>
+      <w:r>
+        <w:rPr>
+          <w:rFonts w:ascii="Times New Roman" w:eastAsia="Times New Roman" w:hAnsi="Times New Roman"/>
+          <w:color w:val="0E0E0E"/>
+          <w:sz w:val="18"/>
+          <w:szCs w:val="18"/>
+          <w:lang w:eastAsia="pl-PL"/>
+        </w:rPr>
+      </w:r>
+      <w:proofErr w:type="spellEnd"/>
+      <w:r>
+        <w:rPr>
+          <w:rFonts w:ascii="Times New Roman" w:eastAsia="Times New Roman" w:hAnsi="Times New Roman"/>
+          <w:color w:val="0E0E0E"/>
+          <w:sz w:val="18"/>
+          <w:szCs w:val="18"/>
+          <w:lang w:eastAsia="pl-PL"/>
+        </w:rPr>
+      </w:r>
+      <w:r>
+        <w:rPr>
+          <w:rFonts w:ascii="Times New Roman" w:eastAsia="Times New Roman" w:hAnsi="Times New Roman"/>
+          <w:color w:val="0E0E0E"/>
+          <w:sz w:val="20"/>
+          <w:szCs w:val="20"/>
+          <w:lang w:eastAsia="pl-PL"/>
+        </w:rPr>
+      </w:r>
+      <w:r>
+        <w:rPr>
+          <w:rFonts w:ascii="Times New Roman" w:eastAsia="Times New Roman" w:hAnsi="Times New Roman"/>
+          <w:color w:val="0E0E0E"/>
+          <w:sz w:val="20"/>
+          <w:szCs w:val="20"/>
+          <w:lang w:eastAsia="pl-PL"/>
+        </w:rPr>
+      </w:r>
+    </w:p>
+    <w:p>
+      <w:pPr>
+        <w:spacing w:before="120" w:after="0" w:line="360" w:lineRule="auto"/>
+        <w:jc w:val="right"/>
+        <w:rPr>
+          <w:rFonts w:ascii="Times New Roman" w:eastAsia="Times New Roman" w:hAnsi="Times New Roman"/>
+          <w:color w:val="0E0E0E"/>
+          <w:sz w:val="20"/>
+          <w:szCs w:val="20"/>
+          <w:lang w:eastAsia="pl-PL"/>
+        </w:rPr>
+      </w:pPr>
+      <w:r>
+        <w:rPr>
+          <w:rFonts w:ascii="Times New Roman" w:eastAsia="Times New Roman" w:hAnsi="Times New Roman"/>
+          <w:b/>
+          <w:color w:val="0E0E0E"/>
+          <w:sz w:val="20"/>
+          <w:szCs w:val="20"/>
+          <w:lang w:eastAsia="pl-PL"/>
+        </w:rPr>
+        <w:t xml:space="preserve">RAZEM: </w:t>
+      </w:r>
+      <w:r>
+        <w:rPr>
+          <w:rFonts w:ascii="Times New Roman" w:eastAsia="Times New Roman" w:hAnsi="Times New Roman"/>
+          <w:color w:val="0E0E0E"/>
+          <w:sz w:val="20"/>
+          <w:szCs w:val="20"/>
+          <w:lang w:eastAsia="pl-PL"/>
+        </w:rPr>
+        <w:t>{{potracenie_2}} zł</w:t>
+      </w:r>
+      <w:r>
+        <w:rPr>
+          <w:rFonts w:ascii="Times New Roman" w:eastAsia="Times New Roman" w:hAnsi="Times New Roman"/>
+          <w:color w:val="0E0E0E"/>
+          <w:sz w:val="20"/>
+          <w:szCs w:val="20"/>
+          <w:lang w:eastAsia="pl-PL"/>
+        </w:rPr>
+      </w:r>
+      <w:r>
+        <w:rPr>
+          <w:rFonts w:ascii="Times New Roman" w:eastAsia="Times New Roman" w:hAnsi="Times New Roman"/>
+          <w:color w:val="0E0E0E"/>
+          <w:sz w:val="20"/>
+          <w:szCs w:val="20"/>
+          <w:lang w:eastAsia="pl-PL"/>
+        </w:rPr>
+      </w:r>
+      <w:r>
+        <w:rPr>
+          <w:rFonts w:ascii="Times New Roman" w:eastAsia="Times New Roman" w:hAnsi="Times New Roman"/>
+          <w:color w:val="0E0E0E"/>
+          <w:sz w:val="20"/>
+          <w:szCs w:val="20"/>
+          <w:lang w:eastAsia="pl-PL"/>
+        </w:rPr>
+      </w:r>
+    </w:p>
+    <w:p>
+      <w:pPr>
+        <w:spacing w:after="0" w:line="360" w:lineRule="auto"/>
+        <w:jc w:val="right"/>
+        <w:rPr>
+          <w:rFonts w:ascii="Times New Roman" w:eastAsia="Times New Roman" w:hAnsi="Times New Roman"/>
+          <w:color w:val="0E0E0E"/>
+          <w:sz w:val="20"/>
+          <w:szCs w:val="20"/>
+          <w:lang w:eastAsia="pl-PL"/>
+        </w:rPr>
+      </w:pPr>
+      <w:r>
+        <w:rPr>
+          <w:rFonts w:ascii="Times New Roman" w:eastAsia="Times New Roman" w:hAnsi="Times New Roman"/>
+          <w:b/>
+          <w:color w:val="0E0E0E"/>
+          <w:sz w:val="20"/>
+          <w:szCs w:val="20"/>
+          <w:lang w:eastAsia="pl-PL"/>
+        </w:rPr>
+        <w:t xml:space="preserve">RYCZAŁT DO WYPŁATY: </w:t>
+      </w:r>
+      <w:r>
+        <w:rPr>
+          <w:rFonts w:ascii="Times New Roman" w:eastAsia="Times New Roman" w:hAnsi="Times New Roman"/>
+          <w:color w:val="0E0E0E"/>
+          <w:sz w:val="20"/>
+          <w:szCs w:val="20"/>
+          <w:lang w:eastAsia="pl-PL"/>
+        </w:rPr>
+        <w:t>{{ryczalt_do_wyplaty_2}} zł</w:t>
+      </w:r>
+    </w:p>
+    <w:p>
+      <w:pPr>
+        <w:spacing w:after="120" w:line="360" w:lineRule="auto"/>
+        <w:jc w:val="right"/>
+        <w:rPr>
+          <w:rFonts w:ascii="Times New Roman" w:eastAsia="Times New Roman" w:hAnsi="Times New Roman"/>
+          <w:color w:val="0E0E0E"/>
+          <w:sz w:val="20"/>
+          <w:szCs w:val="20"/>
+          <w:lang w:eastAsia="pl-PL"/>
+        </w:rPr>
+      </w:pPr>
+      <w:r>
+        <w:rPr>
+          <w:rFonts w:ascii="Times New Roman" w:eastAsia="Times New Roman" w:hAnsi="Times New Roman"/>
+          <w:b/>
+          <w:color w:val="0E0E0E"/>
+          <w:sz w:val="20"/>
+          <w:szCs w:val="20"/>
+          <w:lang w:eastAsia="pl-PL"/>
+        </w:rPr>
+        <w:t xml:space="preserve">Proszę o wypłacenie należności: </w:t>
+      </w:r>
+      <w:r>
+        <w:rPr>
+          <w:rFonts w:ascii="Times New Roman" w:eastAsia="Times New Roman" w:hAnsi="Times New Roman"/>
+          <w:color w:val="0E0E0E"/>
+          <w:sz w:val="20"/>
+          <w:szCs w:val="20"/>
+          <w:lang w:eastAsia="pl-PL"/>
+        </w:rPr>
+        <w:t>{{ryczalt_do_wyplaty_2}} zł</w:t>
+      </w:r>
+    </w:p>
+    <w:p>
+      <w:pPr>
+        <w:spacing w:after="120" w:line="240" w:lineRule="auto"/>
+        <w:jc w:val="right"/>
+        <w:rPr>
+          <w:rFonts w:ascii="Times New Roman" w:eastAsia="Times New Roman" w:hAnsi="Times New Roman"/>
+          <w:color w:val="0E0E0E"/>
+          <w:sz w:val="18"/>
+          <w:szCs w:val="18"/>
+          <w:lang w:eastAsia="pl-PL"/>
+        </w:rPr>
+      </w:pPr>
+      <w:r>
+        <w:rPr>
+          <w:rFonts w:ascii="Times New Roman" w:eastAsia="Times New Roman" w:hAnsi="Times New Roman"/>
+          <w:color w:val="0E0E0E"/>
+          <w:sz w:val="18"/>
+          <w:szCs w:val="18"/>
+          <w:lang w:eastAsia="pl-PL"/>
+        </w:rPr>
+        <w:t>Kwituję odbiór kwoty: {{ryczalt_do_wyplaty_2}} zł</w:t>
+      </w:r>
+      <w:r>
+        <w:rPr>
+          <w:rFonts w:ascii="Times New Roman" w:eastAsia="Times New Roman" w:hAnsi="Times New Roman"/>
+          <w:color w:val="0E0E0E"/>
+          <w:sz w:val="18"/>
+          <w:szCs w:val="18"/>
+          <w:lang w:eastAsia="pl-PL"/>
+        </w:rPr>
+      </w:r>
+    </w:p>
+    <w:p>
+      <w:pPr>
+        <w:spacing w:after="120" w:line="240" w:lineRule="auto"/>
+        <w:jc w:val="right"/>
+        <w:rPr>
+          <w:rFonts w:ascii="Times New Roman" w:eastAsia="Times New Roman" w:hAnsi="Times New Roman"/>
+          <w:color w:val="0E0E0E"/>
+          <w:sz w:val="18"/>
+          <w:szCs w:val="18"/>
+          <w:lang w:eastAsia="pl-PL"/>
+        </w:rPr>
+      </w:pPr>
+      <w:r>
+        <w:rPr>
+          <w:rFonts w:ascii="Times New Roman" w:eastAsia="Times New Roman" w:hAnsi="Times New Roman"/>
+          <w:color w:val="0E0E0E"/>
+          <w:sz w:val="18"/>
+          <w:szCs w:val="18"/>
+          <w:lang w:eastAsia="pl-PL"/>
+        </w:rPr>
+        <w:t>słownie: {{kwota_slownie_2}}</w:t>
+      </w:r>
+    </w:p>
+    <w:p>
+      <w:pPr>
+        <w:spacing w:after="120" w:line="240" w:lineRule="auto"/>
+        <w:jc w:val="right"/>
+        <w:rPr>
+          <w:rFonts w:ascii="Times New Roman" w:eastAsia="Times New Roman" w:hAnsi="Times New Roman"/>
+          <w:color w:val="0E0E0E"/>
+          <w:sz w:val="18"/>
+          <w:szCs w:val="18"/>
+          <w:lang w:eastAsia="pl-PL"/>
+        </w:rPr>
+      </w:pPr>
+      <w:r>
+        <w:rPr>
+          <w:rFonts w:ascii="Times New Roman" w:eastAsia="Times New Roman" w:hAnsi="Times New Roman"/>
+          <w:color w:val="0E0E0E"/>
+          <w:sz w:val="18"/>
+          <w:szCs w:val="18"/>
+          <w:lang w:eastAsia="pl-PL"/>
+        </w:rPr>
+      </w:r>
+    </w:p>
+    <w:p>
+      <w:pPr>
+        <w:spacing w:after="120" w:line="240" w:lineRule="auto"/>
+        <w:jc w:val="right"/>
+        <w:rPr>
+          <w:rFonts w:ascii="Times New Roman" w:eastAsia="Times New Roman" w:hAnsi="Times New Roman"/>
+          <w:color w:val="0E0E0E"/>
+          <w:sz w:val="18"/>
+          <w:szCs w:val="18"/>
+          <w:lang w:eastAsia="pl-PL"/>
+        </w:rPr>
+      </w:pPr>
+      <w:r>
+        <w:rPr>
+          <w:rFonts w:ascii="Times New Roman" w:eastAsia="Times New Roman" w:hAnsi="Times New Roman"/>
+          <w:color w:val="0E0E0E"/>
+          <w:sz w:val="18"/>
+          <w:szCs w:val="18"/>
+          <w:lang w:eastAsia="pl-PL"/>
+        </w:rPr>
+      </w:r>
+    </w:p>
+    <w:p>
+      <w:pPr>
+        <w:spacing w:after="0" w:line="240" w:lineRule="auto"/>
+        <w:rPr>
+          <w:rFonts w:ascii="Times New Roman" w:eastAsia="Times New Roman" w:hAnsi="Times New Roman"/>
+          <w:color w:val="0E0E0E"/>
+          <w:sz w:val="18"/>
+          <w:szCs w:val="18"/>
+          <w:lang w:eastAsia="pl-PL"/>
+        </w:rPr>
+      </w:pPr>
+      <w:r>
+        <w:rPr>
+          <w:rFonts w:ascii="Times New Roman" w:eastAsia="Times New Roman" w:hAnsi="Times New Roman"/>
+          <w:color w:val="0E0E0E"/>
+          <w:sz w:val="18"/>
+          <w:szCs w:val="18"/>
+          <w:lang w:eastAsia="pl-PL"/>
+        </w:rPr>
+        <w:t>……………</w:t>
+      </w:r>
+      <w:r>
+        <w:rPr>
+          <w:rFonts w:ascii="Times New Roman" w:eastAsia="Times New Roman" w:hAnsi="Times New Roman"/>
+          <w:color w:val="0E0E0E"/>
+          <w:sz w:val="18"/>
+          <w:szCs w:val="18"/>
+          <w:lang w:eastAsia="pl-PL"/>
+        </w:rPr>
+        <w:t>…………</w:t>
+      </w:r>
+      <w:r>
+        <w:rPr>
+          <w:rFonts w:ascii="Times New Roman" w:eastAsia="Times New Roman" w:hAnsi="Times New Roman"/>
+          <w:color w:val="0E0E0E"/>
+          <w:sz w:val="18"/>
+          <w:szCs w:val="18"/>
+          <w:lang w:eastAsia="pl-PL"/>
+        </w:rPr>
+        <w:t>……….</w:t>
+      </w:r>
+    </w:p>
+    <w:p>
+      <w:pPr>
+        <w:spacing w:after="0" w:line="240" w:lineRule="auto"/>
+        <w:rPr>
+          <w:rFonts w:ascii="Times New Roman" w:eastAsia="Times New Roman" w:hAnsi="Times New Roman"/>
+          <w:color w:val="0E0E0E"/>
+          <w:sz w:val="16"/>
+          <w:szCs w:val="16"/>
+          <w:lang w:eastAsia="pl-PL"/>
+        </w:rPr>
+      </w:pPr>
+      <w:r>
+        <w:rPr>
+          <w:rFonts w:ascii="Times New Roman" w:eastAsia="Times New Roman" w:hAnsi="Times New Roman"/>
+          <w:color w:val="0E0E0E"/>
+          <w:sz w:val="16"/>
+          <w:szCs w:val="16"/>
+          <w:lang w:eastAsia="pl-PL"/>
+        </w:rPr>
+        <w:t xml:space="preserve">          </w:t>
+      </w:r>
+      <w:r>
+        <w:rPr>
+          <w:rFonts w:ascii="Times New Roman" w:eastAsia="Times New Roman" w:hAnsi="Times New Roman"/>
+          <w:color w:val="0E0E0E"/>
+          <w:sz w:val="16"/>
+          <w:szCs w:val="16"/>
+          <w:lang w:eastAsia="pl-PL"/>
+        </w:rPr>
+        <w:t>(podpis rozliczającego)</w:t>
+      </w:r>
+    </w:p>
+    <w:p>
+      <w:pPr>
+        <w:spacing w:after="0" w:line="240" w:lineRule="auto"/>
+        <w:rPr>
+          <w:rFonts w:ascii="Times New Roman" w:eastAsia="Times New Roman" w:hAnsi="Times New Roman"/>
+          <w:color w:val="0E0E0E"/>
+          <w:sz w:val="16"/>
+          <w:szCs w:val="16"/>
+          <w:lang w:eastAsia="pl-PL"/>
+        </w:rPr>
+      </w:pPr>
+    </w:p>
+    <w:p>
+      <w:pPr>
+        <w:spacing w:after="0" w:line="240" w:lineRule="auto"/>
+        <w:rPr>
+          <w:rFonts w:ascii="Times New Roman" w:eastAsia="Times New Roman" w:hAnsi="Times New Roman"/>
+          <w:color w:val="0E0E0E"/>
+          <w:sz w:val="16"/>
+          <w:szCs w:val="16"/>
+          <w:lang w:eastAsia="pl-PL"/>
+        </w:rPr>
+      </w:pPr>
+    </w:p>
+    <w:p>
+      <w:pPr>
+        <w:spacing w:after="0" w:line="240" w:lineRule="auto"/>
+        <w:rPr>
+          <w:rFonts w:ascii="Times New Roman" w:eastAsia="Times New Roman" w:hAnsi="Times New Roman"/>
+          <w:color w:val="0E0E0E"/>
+          <w:sz w:val="16"/>
+          <w:szCs w:val="16"/>
+          <w:lang w:eastAsia="pl-PL"/>
+        </w:rPr>
+      </w:pPr>
+    </w:p>
+    <w:p>
+      <w:pPr>
+        <w:spacing w:after="0" w:line="240" w:lineRule="auto"/>
+        <w:jc w:val="right"/>
+        <w:rPr>
+          <w:rFonts w:ascii="Times New Roman" w:eastAsia="Times New Roman" w:hAnsi="Times New Roman"/>
+          <w:color w:val="0E0E0E"/>
+          <w:sz w:val="20"/>
+          <w:szCs w:val="20"/>
+          <w:lang w:eastAsia="pl-PL"/>
+        </w:rPr>
+      </w:pPr>
+      <w:r>
+        <w:rPr>
+          <w:rFonts w:ascii="Times New Roman" w:eastAsia="Times New Roman" w:hAnsi="Times New Roman"/>
+          <w:color w:val="0E0E0E"/>
+          <w:sz w:val="20"/>
+          <w:szCs w:val="20"/>
+          <w:lang w:eastAsia="pl-PL"/>
+        </w:rPr>
+        <w:t>{{data_wystawienia_2}}</w:t>
+        <w:tab/>
+        <w:tab/>
+        <w:tab/>
+        <w:t>…..………………..</w:t>
+      </w:r>
+      <w:r>
+        <w:rPr>
+          <w:rFonts w:ascii="Times New Roman" w:eastAsia="Times New Roman" w:hAnsi="Times New Roman"/>
+          <w:color w:val="0E0E0E"/>
+          <w:sz w:val="20"/>
+          <w:szCs w:val="20"/>
+          <w:lang w:eastAsia="pl-PL"/>
+        </w:rPr>
+      </w:r>
+      <w:r>
+        <w:rPr>
+          <w:rFonts w:ascii="Times New Roman" w:eastAsia="Times New Roman" w:hAnsi="Times New Roman"/>
+          <w:color w:val="0E0E0E"/>
+          <w:sz w:val="20"/>
+          <w:szCs w:val="20"/>
+          <w:lang w:eastAsia="pl-PL"/>
+        </w:rPr>
+      </w:r>
+      <w:r>
+        <w:rPr>
+          <w:rFonts w:ascii="Times New Roman" w:eastAsia="Times New Roman" w:hAnsi="Times New Roman"/>
+          <w:color w:val="0E0E0E"/>
+          <w:sz w:val="20"/>
+          <w:szCs w:val="20"/>
+          <w:lang w:eastAsia="pl-PL"/>
+        </w:rPr>
+      </w:r>
+      <w:r>
+        <w:rPr>
+          <w:rFonts w:ascii="Times New Roman" w:eastAsia="Times New Roman" w:hAnsi="Times New Roman"/>
+          <w:color w:val="0E0E0E"/>
+          <w:sz w:val="20"/>
+          <w:szCs w:val="20"/>
+          <w:lang w:eastAsia="pl-PL"/>
+        </w:rPr>
+      </w:r>
+    </w:p>
+    <w:p>
+      <w:pPr>
+        <w:spacing w:after="0" w:line="240" w:lineRule="auto"/>
+        <w:ind w:left="2124" w:firstLine="708"/>
         <w:jc w:val="center"/>
         <w:rPr>
           <w:rFonts w:ascii="Times New Roman" w:eastAsia="Times New Roman" w:hAnsi="Times New Roman"/>
@@ -1413,1416 +2544,6 @@
       <w:cols w:num="2" w:space="708"/>
       <w:docGrid w:linePitch="360"/>
     </w:sectPr>
-    <w:p>
-      <w:r>
-        <w:br w:type="page"/>
-      </w:r>
-    </w:p>
-    <w:p>
-      <w:pPr>
-        <w:spacing w:after="0" w:line="240" w:lineRule="auto"/>
-        <w:jc w:val="right"/>
-        <w:rPr>
-          <w:rFonts w:ascii="Times New Roman" w:eastAsia="Times New Roman" w:hAnsi="Times New Roman"/>
-          <w:color w:val="0E0E0E"/>
-          <w:sz w:val="24"/>
-          <w:szCs w:val="24"/>
-          <w:lang w:eastAsia="pl-PL"/>
-        </w:rPr>
-      </w:pPr>
-      <w:r>
-        <w:rPr>
-          <w:rFonts w:ascii="Times New Roman" w:eastAsia="Times New Roman" w:hAnsi="Times New Roman"/>
-          <w:color w:val="0E0E0E"/>
-          <w:sz w:val="24"/>
-          <w:szCs w:val="24"/>
-          <w:lang w:eastAsia="pl-PL"/>
-        </w:rPr>
-        <w:t>{{imie_nazwisko_2}}</w:t>
-      </w:r>
-      <w:r>
-        <w:rPr>
-          <w:rFonts w:ascii="Times New Roman" w:eastAsia="Times New Roman" w:hAnsi="Times New Roman"/>
-          <w:color w:val="0E0E0E"/>
-          <w:sz w:val="24"/>
-          <w:szCs w:val="24"/>
-          <w:lang w:eastAsia="pl-PL"/>
-        </w:rPr>
-      </w:r>
-      <w:r>
-        <w:rPr>
-          <w:rFonts w:ascii="Times New Roman" w:eastAsia="Times New Roman" w:hAnsi="Times New Roman"/>
-          <w:color w:val="0E0E0E"/>
-          <w:sz w:val="24"/>
-          <w:szCs w:val="24"/>
-          <w:lang w:eastAsia="pl-PL"/>
-        </w:rPr>
-        <w:tab/>
-      </w:r>
-      <w:r>
-        <w:rPr>
-          <w:rFonts w:ascii="Times New Roman" w:eastAsia="Times New Roman" w:hAnsi="Times New Roman"/>
-          <w:color w:val="0E0E0E"/>
-          <w:sz w:val="24"/>
-          <w:szCs w:val="24"/>
-          <w:lang w:eastAsia="pl-PL"/>
-        </w:rPr>
-        <w:tab/>
-      </w:r>
-      <w:r>
-        <w:rPr>
-          <w:rFonts w:ascii="Times New Roman" w:eastAsia="Times New Roman" w:hAnsi="Times New Roman"/>
-          <w:color w:val="0E0E0E"/>
-          <w:sz w:val="24"/>
-          <w:szCs w:val="24"/>
-          <w:lang w:eastAsia="pl-PL"/>
-        </w:rPr>
-        <w:tab/>
-      </w:r>
-      <w:r>
-        <w:rPr>
-          <w:rFonts w:ascii="Times New Roman" w:eastAsia="Times New Roman" w:hAnsi="Times New Roman"/>
-          <w:color w:val="0E0E0E"/>
-          <w:sz w:val="24"/>
-          <w:szCs w:val="24"/>
-          <w:lang w:eastAsia="pl-PL"/>
-        </w:rPr>
-        <w:t>{{data_wystawienia_2}}</w:t>
-      </w:r>
-    </w:p>
-    <w:p>
-      <w:pPr>
-        <w:spacing w:after="0" w:line="240" w:lineRule="auto"/>
-        <w:rPr>
-          <w:rFonts w:ascii="Times New Roman" w:eastAsia="Times New Roman" w:hAnsi="Times New Roman"/>
-          <w:color w:val="0E0E0E"/>
-          <w:sz w:val="16"/>
-          <w:szCs w:val="16"/>
-          <w:lang w:eastAsia="pl-PL"/>
-        </w:rPr>
-      </w:pPr>
-      <w:r>
-        <w:rPr>
-          <w:rFonts w:ascii="Times New Roman" w:eastAsia="Times New Roman" w:hAnsi="Times New Roman"/>
-          <w:color w:val="0E0E0E"/>
-          <w:sz w:val="16"/>
-          <w:szCs w:val="16"/>
-          <w:lang w:eastAsia="pl-PL"/>
-        </w:rPr>
-        <w:t xml:space="preserve">              </w:t>
-      </w:r>
-      <w:r>
-        <w:rPr>
-          <w:rFonts w:ascii="Times New Roman" w:eastAsia="Times New Roman" w:hAnsi="Times New Roman"/>
-          <w:color w:val="0E0E0E"/>
-          <w:sz w:val="16"/>
-          <w:szCs w:val="16"/>
-          <w:lang w:eastAsia="pl-PL"/>
-        </w:rPr>
-        <w:t>(imię i nazwisko)</w:t>
-      </w:r>
-      <w:r>
-        <w:rPr>
-          <w:rFonts w:ascii="Times New Roman" w:eastAsia="Times New Roman" w:hAnsi="Times New Roman"/>
-          <w:color w:val="0E0E0E"/>
-          <w:sz w:val="16"/>
-          <w:szCs w:val="16"/>
-          <w:lang w:eastAsia="pl-PL"/>
-        </w:rPr>
-        <w:tab/>
-      </w:r>
-      <w:r>
-        <w:rPr>
-          <w:rFonts w:ascii="Times New Roman" w:eastAsia="Times New Roman" w:hAnsi="Times New Roman"/>
-          <w:color w:val="0E0E0E"/>
-          <w:sz w:val="16"/>
-          <w:szCs w:val="16"/>
-          <w:lang w:eastAsia="pl-PL"/>
-        </w:rPr>
-        <w:tab/>
-      </w:r>
-      <w:r>
-        <w:rPr>
-          <w:rFonts w:ascii="Times New Roman" w:eastAsia="Times New Roman" w:hAnsi="Times New Roman"/>
-          <w:color w:val="0E0E0E"/>
-          <w:sz w:val="16"/>
-          <w:szCs w:val="16"/>
-          <w:lang w:eastAsia="pl-PL"/>
-        </w:rPr>
-        <w:tab/>
-      </w:r>
-      <w:r>
-        <w:rPr>
-          <w:rFonts w:ascii="Times New Roman" w:eastAsia="Times New Roman" w:hAnsi="Times New Roman"/>
-          <w:color w:val="0E0E0E"/>
-          <w:sz w:val="16"/>
-          <w:szCs w:val="16"/>
-          <w:lang w:eastAsia="pl-PL"/>
-        </w:rPr>
-        <w:tab/>
-      </w:r>
-      <w:r>
-        <w:rPr>
-          <w:rFonts w:ascii="Times New Roman" w:eastAsia="Times New Roman" w:hAnsi="Times New Roman"/>
-          <w:color w:val="0E0E0E"/>
-          <w:sz w:val="16"/>
-          <w:szCs w:val="16"/>
-          <w:lang w:eastAsia="pl-PL"/>
-        </w:rPr>
-        <w:tab/>
-        <w:t>(data)</w:t>
-      </w:r>
-    </w:p>
-    <w:p>
-      <w:pPr>
-        <w:spacing w:before="240" w:after="0" w:line="240" w:lineRule="auto"/>
-        <w:rPr>
-          <w:rFonts w:ascii="Times New Roman" w:eastAsia="Times New Roman" w:hAnsi="Times New Roman"/>
-          <w:color w:val="0E0E0E"/>
-          <w:sz w:val="24"/>
-          <w:szCs w:val="24"/>
-          <w:lang w:eastAsia="pl-PL"/>
-        </w:rPr>
-      </w:pPr>
-      <w:r>
-        <w:rPr>
-          <w:rFonts w:ascii="Times New Roman" w:eastAsia="Times New Roman" w:hAnsi="Times New Roman"/>
-          <w:color w:val="0E0E0E"/>
-          <w:sz w:val="24"/>
-          <w:szCs w:val="24"/>
-          <w:lang w:eastAsia="pl-PL"/>
-        </w:rPr>
-        <w:t>{{stanowisko_2}}</w:t>
-      </w:r>
-    </w:p>
-    <w:p>
-      <w:pPr>
-        <w:spacing w:after="0" w:line="240" w:lineRule="auto"/>
-        <w:rPr>
-          <w:rFonts w:ascii="Times New Roman" w:eastAsia="Times New Roman" w:hAnsi="Times New Roman"/>
-          <w:color w:val="0E0E0E"/>
-          <w:sz w:val="16"/>
-          <w:szCs w:val="16"/>
-          <w:lang w:eastAsia="pl-PL"/>
-        </w:rPr>
-      </w:pPr>
-      <w:r>
-        <w:rPr>
-          <w:rFonts w:ascii="Times New Roman" w:eastAsia="Times New Roman" w:hAnsi="Times New Roman"/>
-          <w:color w:val="0E0E0E"/>
-          <w:sz w:val="16"/>
-          <w:szCs w:val="16"/>
-          <w:lang w:eastAsia="pl-PL"/>
-        </w:rPr>
-        <w:t xml:space="preserve">              (stanowisko służbowe</w:t>
-      </w:r>
-      <w:r>
-        <w:rPr>
-          <w:rFonts w:ascii="Times New Roman" w:eastAsia="Times New Roman" w:hAnsi="Times New Roman"/>
-          <w:color w:val="0E0E0E"/>
-          <w:sz w:val="16"/>
-          <w:szCs w:val="16"/>
-          <w:lang w:eastAsia="pl-PL"/>
-        </w:rPr>
-        <w:t>)</w:t>
-      </w:r>
-    </w:p>
-    <w:p>
-      <w:pPr>
-        <w:spacing w:after="0" w:line="240" w:lineRule="auto"/>
-        <w:rPr>
-          <w:rFonts w:ascii="Times New Roman" w:eastAsia="Times New Roman" w:hAnsi="Times New Roman"/>
-          <w:color w:val="0E0E0E"/>
-          <w:sz w:val="24"/>
-          <w:szCs w:val="24"/>
-          <w:lang w:eastAsia="pl-PL"/>
-        </w:rPr>
-      </w:pPr>
-    </w:p>
-    <w:p>
-      <w:pPr>
-        <w:spacing w:after="0" w:line="240" w:lineRule="auto"/>
-        <w:jc w:val="center"/>
-        <w:rPr>
-          <w:rFonts w:ascii="Times New Roman" w:eastAsia="Times New Roman" w:hAnsi="Times New Roman"/>
-          <w:color w:val="0E0E0E"/>
-          <w:sz w:val="32"/>
-          <w:szCs w:val="32"/>
-          <w:lang w:eastAsia="pl-PL"/>
-        </w:rPr>
-      </w:pPr>
-      <w:r>
-        <w:rPr>
-          <w:rFonts w:ascii="Times New Roman" w:eastAsia="Times New Roman" w:hAnsi="Times New Roman"/>
-          <w:b/>
-          <w:bCs/>
-          <w:sz w:val="32"/>
-          <w:szCs w:val="32"/>
-          <w:lang w:eastAsia="pl-PL"/>
-        </w:rPr>
-        <w:t>OŚWIADCZENIE</w:t>
-      </w:r>
-      <w:r>
-        <w:rPr>
-          <w:rFonts w:ascii="Times New Roman" w:eastAsia="Times New Roman" w:hAnsi="Times New Roman"/>
-          <w:b/>
-          <w:bCs/>
-          <w:sz w:val="32"/>
-          <w:szCs w:val="32"/>
-          <w:lang w:eastAsia="pl-PL"/>
-        </w:rPr>
-        <w:t xml:space="preserve"> </w:t>
-      </w:r>
-    </w:p>
-    <w:p>
-      <w:pPr>
-        <w:spacing w:after="0" w:line="240" w:lineRule="auto"/>
-        <w:rPr>
-          <w:rFonts w:ascii="Times New Roman" w:eastAsia="Times New Roman" w:hAnsi="Times New Roman"/>
-          <w:color w:val="0E0E0E"/>
-          <w:sz w:val="24"/>
-          <w:szCs w:val="24"/>
-          <w:lang w:eastAsia="pl-PL"/>
-        </w:rPr>
-      </w:pPr>
-    </w:p>
-    <w:p>
-      <w:pPr>
-        <w:spacing w:after="160" w:line="240" w:lineRule="auto"/>
-        <w:jc w:val="right"/>
-        <w:rPr>
-          <w:rFonts w:ascii="Times New Roman" w:eastAsia="Times New Roman" w:hAnsi="Times New Roman"/>
-          <w:color w:val="0E0E0E"/>
-          <w:sz w:val="24"/>
-          <w:szCs w:val="24"/>
-          <w:lang w:eastAsia="pl-PL"/>
-        </w:rPr>
-      </w:pPr>
-      <w:r>
-        <w:rPr>
-          <w:rFonts w:ascii="Times New Roman" w:eastAsia="Times New Roman" w:hAnsi="Times New Roman"/>
-          <w:b/>
-          <w:color w:val="0E0E0E"/>
-          <w:lang w:eastAsia="pl-PL"/>
-        </w:rPr>
-        <w:t xml:space="preserve">o </w:t>
-      </w:r>
-      <w:r>
-        <w:rPr>
-          <w:rFonts w:ascii="Times New Roman" w:eastAsia="Times New Roman" w:hAnsi="Times New Roman"/>
-          <w:b/>
-          <w:color w:val="0E0E0E"/>
-          <w:lang w:eastAsia="pl-PL"/>
-        </w:rPr>
-        <w:t xml:space="preserve">używaniu </w:t>
-      </w:r>
-      <w:r>
-        <w:rPr>
-          <w:rFonts w:ascii="Times New Roman" w:eastAsia="Times New Roman" w:hAnsi="Times New Roman"/>
-          <w:b/>
-          <w:color w:val="0E0E0E"/>
-          <w:lang w:eastAsia="pl-PL"/>
-        </w:rPr>
-        <w:t>własnego samochodu nr rej.:</w:t>
-      </w:r>
-      <w:r>
-        <w:rPr>
-          <w:rFonts w:ascii="Times New Roman" w:eastAsia="Times New Roman" w:hAnsi="Times New Roman"/>
-          <w:b w:val="0"/>
-          <w:color w:val="0E0E0E"/>
-          <w:lang w:eastAsia="pl-PL"/>
-        </w:rPr>
-        <w:t xml:space="preserve"> {{nr_rejestracyjny_2}}</w:t>
-      </w:r>
-      <w:r>
-        <w:rPr>
-          <w:rFonts w:ascii="Times New Roman" w:eastAsia="Times New Roman" w:hAnsi="Times New Roman"/>
-          <w:color w:val="0E0E0E"/>
-          <w:sz w:val="24"/>
-          <w:szCs w:val="24"/>
-          <w:lang w:eastAsia="pl-PL"/>
-        </w:rPr>
-      </w:r>
-      <w:r>
-        <w:rPr>
-          <w:rFonts w:ascii="Times New Roman" w:eastAsia="Times New Roman" w:hAnsi="Times New Roman"/>
-          <w:color w:val="0E0E0E"/>
-          <w:sz w:val="24"/>
-          <w:szCs w:val="24"/>
-          <w:lang w:eastAsia="pl-PL"/>
-        </w:rPr>
-      </w:r>
-      <w:r>
-        <w:rPr>
-          <w:rFonts w:ascii="Times New Roman" w:eastAsia="Times New Roman" w:hAnsi="Times New Roman"/>
-          <w:color w:val="0E0E0E"/>
-          <w:sz w:val="24"/>
-          <w:szCs w:val="24"/>
-          <w:lang w:eastAsia="pl-PL"/>
-        </w:rPr>
-      </w:r>
-      <w:r>
-        <w:rPr>
-          <w:rFonts w:ascii="Times New Roman" w:eastAsia="Times New Roman" w:hAnsi="Times New Roman"/>
-          <w:color w:val="0E0E0E"/>
-          <w:sz w:val="24"/>
-          <w:szCs w:val="24"/>
-          <w:lang w:eastAsia="pl-PL"/>
-        </w:rPr>
-      </w:r>
-      <w:r>
-        <w:rPr>
-          <w:rFonts w:ascii="Times New Roman" w:eastAsia="Times New Roman" w:hAnsi="Times New Roman"/>
-          <w:color w:val="0E0E0E"/>
-          <w:sz w:val="24"/>
-          <w:szCs w:val="24"/>
-          <w:lang w:eastAsia="pl-PL"/>
-        </w:rPr>
-      </w:r>
-      <w:r>
-        <w:rPr>
-          <w:rFonts w:ascii="Times New Roman" w:eastAsia="Times New Roman" w:hAnsi="Times New Roman"/>
-          <w:color w:val="0E0E0E"/>
-          <w:sz w:val="24"/>
-          <w:szCs w:val="24"/>
-          <w:lang w:eastAsia="pl-PL"/>
-        </w:rPr>
-      </w:r>
-    </w:p>
-    <w:p>
-      <w:pPr>
-        <w:spacing w:after="0" w:line="240" w:lineRule="auto"/>
-        <w:ind w:left="2126"/>
-        <w:jc w:val="right"/>
-        <w:rPr>
-          <w:rFonts w:ascii="Times New Roman" w:eastAsia="Times New Roman" w:hAnsi="Times New Roman"/>
-          <w:color w:val="0E0E0E"/>
-          <w:sz w:val="24"/>
-          <w:szCs w:val="24"/>
-          <w:lang w:eastAsia="pl-PL"/>
-        </w:rPr>
-      </w:pPr>
-      <w:r>
-        <w:rPr>
-          <w:rFonts w:ascii="Times New Roman" w:eastAsia="Times New Roman" w:hAnsi="Times New Roman"/>
-          <w:color w:val="0E0E0E"/>
-          <w:sz w:val="24"/>
-          <w:szCs w:val="24"/>
-          <w:lang w:eastAsia="pl-PL"/>
-        </w:rPr>
-        <w:t xml:space="preserve">           </w:t>
-      </w:r>
-      <w:r>
-        <w:rPr>
-          <w:rFonts w:ascii="Times New Roman" w:eastAsia="Times New Roman" w:hAnsi="Times New Roman"/>
-          <w:b/>
-          <w:color w:val="0E0E0E"/>
-          <w:lang w:eastAsia="pl-PL"/>
-        </w:rPr>
-        <w:t>w miesiącu</w:t>
-      </w:r>
-      <w:r>
-        <w:rPr>
-          <w:rFonts w:ascii="Times New Roman" w:eastAsia="Times New Roman" w:hAnsi="Times New Roman"/>
-          <w:color w:val="0E0E0E"/>
-          <w:sz w:val="24"/>
-          <w:szCs w:val="24"/>
-          <w:lang w:eastAsia="pl-PL"/>
-        </w:rPr>
-        <w:t>: {{miesiac_2}}</w:t>
-      </w:r>
-      <w:r>
-        <w:rPr>
-          <w:rFonts w:ascii="Times New Roman" w:eastAsia="Times New Roman" w:hAnsi="Times New Roman"/>
-          <w:color w:val="0E0E0E"/>
-          <w:sz w:val="24"/>
-          <w:szCs w:val="24"/>
-          <w:lang w:eastAsia="pl-PL"/>
-        </w:rPr>
-      </w:r>
-      <w:r>
-        <w:rPr>
-          <w:rFonts w:ascii="Times New Roman" w:eastAsia="Times New Roman" w:hAnsi="Times New Roman"/>
-          <w:color w:val="0E0E0E"/>
-          <w:sz w:val="24"/>
-          <w:szCs w:val="24"/>
-          <w:lang w:eastAsia="pl-PL"/>
-        </w:rPr>
-      </w:r>
-      <w:r>
-        <w:rPr>
-          <w:rFonts w:ascii="Times New Roman" w:eastAsia="Times New Roman" w:hAnsi="Times New Roman"/>
-          <w:color w:val="0E0E0E"/>
-          <w:sz w:val="24"/>
-          <w:szCs w:val="24"/>
-          <w:lang w:eastAsia="pl-PL"/>
-        </w:rPr>
-      </w:r>
-      <w:r>
-        <w:rPr>
-          <w:rFonts w:ascii="Times New Roman" w:eastAsia="Times New Roman" w:hAnsi="Times New Roman"/>
-          <w:color w:val="0E0E0E"/>
-          <w:sz w:val="24"/>
-          <w:szCs w:val="24"/>
-          <w:lang w:eastAsia="pl-PL"/>
-        </w:rPr>
-      </w:r>
-    </w:p>
-    <w:p>
-      <w:pPr>
-        <w:spacing w:after="0" w:line="240" w:lineRule="auto"/>
-        <w:ind w:left="2124"/>
-        <w:jc w:val="right"/>
-        <w:rPr>
-          <w:rFonts w:ascii="Times New Roman" w:eastAsia="Times New Roman" w:hAnsi="Times New Roman"/>
-          <w:color w:val="0E0E0E"/>
-          <w:sz w:val="24"/>
-          <w:szCs w:val="24"/>
-          <w:lang w:eastAsia="pl-PL"/>
-        </w:rPr>
-      </w:pPr>
-    </w:p>
-    <w:p>
-      <w:pPr>
-        <w:spacing w:after="0" w:line="240" w:lineRule="auto"/>
-        <w:ind w:firstLine="284"/>
-        <w:jc w:val="right"/>
-        <w:rPr>
-          <w:rFonts w:ascii="Times New Roman" w:eastAsia="Times New Roman" w:hAnsi="Times New Roman"/>
-          <w:color w:val="0E0E0E"/>
-          <w:sz w:val="20"/>
-          <w:szCs w:val="20"/>
-          <w:lang w:eastAsia="pl-PL"/>
-        </w:rPr>
-      </w:pPr>
-      <w:r>
-        <w:rPr>
-          <w:rFonts w:ascii="Times New Roman" w:eastAsia="Times New Roman" w:hAnsi="Times New Roman"/>
-          <w:color w:val="0E0E0E"/>
-          <w:sz w:val="20"/>
-          <w:szCs w:val="20"/>
-          <w:lang w:eastAsia="pl-PL"/>
-        </w:rPr>
-        <w:t>Oświadczam, że w oparciu o przyznany mi ryczałt za m-c: {{miesiac_ryczalt_2}}</w:t>
-      </w:r>
-      <w:r>
-        <w:rPr>
-          <w:rFonts w:ascii="Times New Roman" w:eastAsia="Times New Roman" w:hAnsi="Times New Roman"/>
-          <w:color w:val="0E0E0E"/>
-          <w:sz w:val="20"/>
-          <w:szCs w:val="20"/>
-          <w:lang w:eastAsia="pl-PL"/>
-        </w:rPr>
-      </w:r>
-      <w:r>
-        <w:rPr>
-          <w:rFonts w:ascii="Times New Roman" w:eastAsia="Times New Roman" w:hAnsi="Times New Roman"/>
-          <w:color w:val="0E0E0E"/>
-          <w:sz w:val="20"/>
-          <w:szCs w:val="20"/>
-          <w:lang w:eastAsia="pl-PL"/>
-        </w:rPr>
-      </w:r>
-      <w:r>
-        <w:rPr>
-          <w:rFonts w:ascii="Times New Roman" w:eastAsia="Times New Roman" w:hAnsi="Times New Roman"/>
-          <w:color w:val="0E0E0E"/>
-          <w:sz w:val="20"/>
-          <w:szCs w:val="20"/>
-          <w:lang w:eastAsia="pl-PL"/>
-        </w:rPr>
-      </w:r>
-      <w:r>
-        <w:rPr>
-          <w:rFonts w:ascii="Times New Roman" w:eastAsia="Times New Roman" w:hAnsi="Times New Roman"/>
-          <w:color w:val="0E0E0E"/>
-          <w:sz w:val="20"/>
-          <w:szCs w:val="20"/>
-          <w:lang w:eastAsia="pl-PL"/>
-        </w:rPr>
-      </w:r>
-      <w:r>
-        <w:rPr>
-          <w:rFonts w:ascii="Times New Roman" w:eastAsia="Times New Roman" w:hAnsi="Times New Roman"/>
-          <w:color w:val="0E0E0E"/>
-          <w:sz w:val="20"/>
-          <w:szCs w:val="20"/>
-          <w:lang w:eastAsia="pl-PL"/>
-        </w:rPr>
-      </w:r>
-      <w:r>
-        <w:rPr>
-          <w:rFonts w:ascii="Times New Roman" w:eastAsia="Times New Roman" w:hAnsi="Times New Roman"/>
-          <w:color w:val="0E0E0E"/>
-          <w:sz w:val="20"/>
-          <w:szCs w:val="20"/>
-          <w:lang w:eastAsia="pl-PL"/>
-        </w:rPr>
-      </w:r>
-    </w:p>
-    <w:p>
-      <w:pPr>
-        <w:spacing w:after="0" w:line="240" w:lineRule="auto"/>
-        <w:rPr>
-          <w:rFonts w:ascii="Times New Roman" w:eastAsia="Times New Roman" w:hAnsi="Times New Roman"/>
-          <w:color w:val="0E0E0E"/>
-          <w:sz w:val="20"/>
-          <w:szCs w:val="20"/>
-          <w:lang w:eastAsia="pl-PL"/>
-        </w:rPr>
-      </w:pPr>
-      <w:r>
-        <w:rPr>
-          <w:rFonts w:ascii="Times New Roman" w:eastAsia="Times New Roman" w:hAnsi="Times New Roman"/>
-          <w:color w:val="0E0E0E"/>
-          <w:sz w:val="20"/>
-          <w:szCs w:val="20"/>
-          <w:lang w:eastAsia="pl-PL"/>
-        </w:rPr>
-        <w:t>na {{limit_km_2}} km. używałem samochód prywatny do celów służbowych.</w:t>
-      </w:r>
-      <w:r>
-        <w:rPr>
-          <w:rFonts w:ascii="Times New Roman" w:eastAsia="Times New Roman" w:hAnsi="Times New Roman"/>
-          <w:color w:val="0E0E0E"/>
-          <w:sz w:val="20"/>
-          <w:szCs w:val="20"/>
-          <w:lang w:eastAsia="pl-PL"/>
-        </w:rPr>
-      </w:r>
-      <w:r>
-        <w:rPr>
-          <w:rFonts w:ascii="Times New Roman" w:eastAsia="Times New Roman" w:hAnsi="Times New Roman"/>
-          <w:color w:val="0E0E0E"/>
-          <w:sz w:val="20"/>
-          <w:szCs w:val="20"/>
-          <w:lang w:eastAsia="pl-PL"/>
-        </w:rPr>
-      </w:r>
-      <w:r>
-        <w:rPr>
-          <w:rFonts w:ascii="Times New Roman" w:eastAsia="Times New Roman" w:hAnsi="Times New Roman"/>
-          <w:color w:val="0E0E0E"/>
-          <w:sz w:val="20"/>
-          <w:szCs w:val="20"/>
-          <w:lang w:eastAsia="pl-PL"/>
-        </w:rPr>
-      </w:r>
-      <w:r>
-        <w:rPr>
-          <w:rFonts w:ascii="Times New Roman" w:eastAsia="Times New Roman" w:hAnsi="Times New Roman"/>
-          <w:color w:val="0E0E0E"/>
-          <w:sz w:val="20"/>
-          <w:szCs w:val="20"/>
-          <w:lang w:eastAsia="pl-PL"/>
-        </w:rPr>
-      </w:r>
-      <w:r>
-        <w:rPr>
-          <w:rFonts w:ascii="Times New Roman" w:eastAsia="Times New Roman" w:hAnsi="Times New Roman"/>
-          <w:color w:val="0E0E0E"/>
-          <w:sz w:val="20"/>
-          <w:szCs w:val="20"/>
-          <w:lang w:eastAsia="pl-PL"/>
-        </w:rPr>
-      </w:r>
-      <w:r>
-        <w:rPr>
-          <w:rFonts w:ascii="Times New Roman" w:eastAsia="Times New Roman" w:hAnsi="Times New Roman"/>
-          <w:color w:val="0E0E0E"/>
-          <w:sz w:val="20"/>
-          <w:szCs w:val="20"/>
-          <w:lang w:eastAsia="pl-PL"/>
-        </w:rPr>
-      </w:r>
-      <w:r>
-        <w:rPr>
-          <w:rFonts w:ascii="Times New Roman" w:eastAsia="Times New Roman" w:hAnsi="Times New Roman"/>
-          <w:color w:val="0E0E0E"/>
-          <w:sz w:val="20"/>
-          <w:szCs w:val="20"/>
-          <w:lang w:eastAsia="pl-PL"/>
-        </w:rPr>
-      </w:r>
-      <w:r>
-        <w:rPr>
-          <w:rFonts w:ascii="Times New Roman" w:eastAsia="Times New Roman" w:hAnsi="Times New Roman"/>
-          <w:color w:val="0E0E0E"/>
-          <w:sz w:val="20"/>
-          <w:szCs w:val="20"/>
-          <w:lang w:eastAsia="pl-PL"/>
-        </w:rPr>
-      </w:r>
-      <w:r>
-        <w:rPr>
-          <w:rFonts w:ascii="Times New Roman" w:eastAsia="Times New Roman" w:hAnsi="Times New Roman"/>
-          <w:color w:val="0E0E0E"/>
-          <w:sz w:val="20"/>
-          <w:szCs w:val="20"/>
-          <w:lang w:eastAsia="pl-PL"/>
-        </w:rPr>
-      </w:r>
-    </w:p>
-    <w:p>
-      <w:pPr>
-        <w:spacing w:after="0" w:line="240" w:lineRule="auto"/>
-        <w:ind w:left="1416" w:firstLine="708"/>
-        <w:jc w:val="right"/>
-        <w:rPr>
-          <w:rFonts w:ascii="Times New Roman" w:eastAsia="Times New Roman" w:hAnsi="Times New Roman"/>
-          <w:color w:val="0E0E0E"/>
-          <w:sz w:val="24"/>
-          <w:szCs w:val="24"/>
-          <w:lang w:eastAsia="pl-PL"/>
-        </w:rPr>
-      </w:pPr>
-      <w:bookmarkStart w:id="0" w:name="_Hlk166702508"/>
-      <w:r>
-        <w:rPr>
-          <w:rFonts w:ascii="Times New Roman" w:eastAsia="Times New Roman" w:hAnsi="Times New Roman"/>
-          <w:color w:val="0E0E0E"/>
-          <w:sz w:val="20"/>
-          <w:szCs w:val="20"/>
-          <w:lang w:eastAsia="pl-PL"/>
-        </w:rPr>
-        <w:t>Ryczałt wykorzystałem w kwocie:                              {{ryczalt_2}} zł</w:t>
-      </w:r>
-      <w:r>
-        <w:rPr>
-          <w:rFonts w:ascii="Times New Roman" w:eastAsia="Times New Roman" w:hAnsi="Times New Roman"/>
-          <w:color w:val="0E0E0E"/>
-          <w:sz w:val="20"/>
-          <w:szCs w:val="20"/>
-          <w:lang w:eastAsia="pl-PL"/>
-        </w:rPr>
-      </w:r>
-      <w:r>
-        <w:rPr>
-          <w:rFonts w:ascii="Times New Roman" w:eastAsia="Times New Roman" w:hAnsi="Times New Roman"/>
-          <w:color w:val="0E0E0E"/>
-          <w:sz w:val="20"/>
-          <w:szCs w:val="20"/>
-          <w:lang w:eastAsia="pl-PL"/>
-        </w:rPr>
-      </w:r>
-      <w:bookmarkEnd w:id="0"/>
-    </w:p>
-    <w:p>
-      <w:pPr>
-        <w:spacing w:before="240" w:after="240" w:line="240" w:lineRule="auto"/>
-        <w:rPr>
-          <w:rFonts w:ascii="Times New Roman" w:eastAsia="Times New Roman" w:hAnsi="Times New Roman"/>
-          <w:b/>
-          <w:color w:val="0E0E0E"/>
-          <w:sz w:val="24"/>
-          <w:szCs w:val="24"/>
-          <w:lang w:eastAsia="pl-PL"/>
-        </w:rPr>
-      </w:pPr>
-      <w:r>
-        <w:rPr>
-          <w:rFonts w:ascii="Times New Roman" w:eastAsia="Times New Roman" w:hAnsi="Times New Roman"/>
-          <w:b/>
-          <w:color w:val="0E0E0E"/>
-          <w:sz w:val="24"/>
-          <w:szCs w:val="24"/>
-          <w:lang w:eastAsia="pl-PL"/>
-        </w:rPr>
-        <w:t>Potrącenia:</w:t>
-      </w:r>
-    </w:p>
-    <w:p>
-      <w:pPr>
-        <w:spacing w:after="120" w:line="240" w:lineRule="auto"/>
-        <w:rPr>
-          <w:rFonts w:ascii="Times New Roman" w:eastAsia="Times New Roman" w:hAnsi="Times New Roman"/>
-          <w:color w:val="0E0E0E"/>
-          <w:sz w:val="18"/>
-          <w:szCs w:val="18"/>
-          <w:lang w:eastAsia="pl-PL"/>
-        </w:rPr>
-      </w:pPr>
-      <w:r>
-        <w:rPr>
-          <w:rFonts w:ascii="Times New Roman" w:eastAsia="Times New Roman" w:hAnsi="Times New Roman"/>
-          <w:color w:val="0E0E0E"/>
-          <w:sz w:val="18"/>
-          <w:szCs w:val="18"/>
-          <w:lang w:eastAsia="pl-PL"/>
-        </w:rPr>
-        <w:t>Za {{dni_urlopu_2}} dni urlopu wypoczynkowego (okolicznościowego,</w:t>
-        <w:br/>
-        <w:t>bezpłatnego), delegacji służbowej, z powodu choroby.</w:t>
-      </w:r>
-      <w:r>
-        <w:rPr>
-          <w:rFonts w:ascii="Times New Roman" w:eastAsia="Times New Roman" w:hAnsi="Times New Roman"/>
-          <w:color w:val="0E0E0E"/>
-          <w:sz w:val="18"/>
-          <w:szCs w:val="18"/>
-          <w:lang w:eastAsia="pl-PL"/>
-        </w:rPr>
-      </w:r>
-      <w:r>
-        <w:rPr>
-          <w:rFonts w:ascii="Times New Roman" w:eastAsia="Times New Roman" w:hAnsi="Times New Roman"/>
-          <w:color w:val="0E0E0E"/>
-          <w:sz w:val="18"/>
-          <w:szCs w:val="18"/>
-          <w:lang w:eastAsia="pl-PL"/>
-        </w:rPr>
-      </w:r>
-    </w:p>
-    <w:p>
-      <w:pPr>
-        <w:spacing w:after="0" w:line="360" w:lineRule="auto"/>
-        <w:ind w:firstLine="570"/>
-        <w:jc w:val="right"/>
-        <w:rPr>
-          <w:rFonts w:ascii="Times New Roman" w:eastAsia="Times New Roman" w:hAnsi="Times New Roman"/>
-          <w:color w:val="0E0E0E"/>
-          <w:sz w:val="20"/>
-          <w:szCs w:val="20"/>
-          <w:lang w:eastAsia="pl-PL"/>
-        </w:rPr>
-      </w:pPr>
-      <w:r>
-        <w:rPr>
-          <w:rFonts w:ascii="Times New Roman" w:eastAsia="Times New Roman" w:hAnsi="Times New Roman"/>
-          <w:color w:val="0E0E0E"/>
-          <w:sz w:val="18"/>
-          <w:szCs w:val="18"/>
-          <w:lang w:eastAsia="pl-PL"/>
-        </w:rPr>
-        <w:t>o 1/22 za każdy dzień j.w. po zł.:                            {{stawka_dzienna_2}} zł</w:t>
-      </w:r>
-      <w:proofErr w:type="spellStart"/>
-      <w:r>
-        <w:rPr>
-          <w:rFonts w:ascii="Times New Roman" w:eastAsia="Times New Roman" w:hAnsi="Times New Roman"/>
-          <w:color w:val="0E0E0E"/>
-          <w:sz w:val="18"/>
-          <w:szCs w:val="18"/>
-          <w:lang w:eastAsia="pl-PL"/>
-        </w:rPr>
-      </w:r>
-      <w:proofErr w:type="spellEnd"/>
-      <w:r>
-        <w:rPr>
-          <w:rFonts w:ascii="Times New Roman" w:eastAsia="Times New Roman" w:hAnsi="Times New Roman"/>
-          <w:color w:val="0E0E0E"/>
-          <w:sz w:val="18"/>
-          <w:szCs w:val="18"/>
-          <w:lang w:eastAsia="pl-PL"/>
-        </w:rPr>
-      </w:r>
-      <w:r>
-        <w:rPr>
-          <w:rFonts w:ascii="Times New Roman" w:eastAsia="Times New Roman" w:hAnsi="Times New Roman"/>
-          <w:color w:val="0E0E0E"/>
-          <w:sz w:val="20"/>
-          <w:szCs w:val="20"/>
-          <w:lang w:eastAsia="pl-PL"/>
-        </w:rPr>
-      </w:r>
-      <w:r>
-        <w:rPr>
-          <w:rFonts w:ascii="Times New Roman" w:eastAsia="Times New Roman" w:hAnsi="Times New Roman"/>
-          <w:color w:val="0E0E0E"/>
-          <w:sz w:val="20"/>
-          <w:szCs w:val="20"/>
-          <w:lang w:eastAsia="pl-PL"/>
-        </w:rPr>
-      </w:r>
-      <w:r>
-        <w:rPr>
-          <w:rFonts w:ascii="Times New Roman" w:eastAsia="Times New Roman" w:hAnsi="Times New Roman"/>
-          <w:color w:val="0E0E0E"/>
-          <w:sz w:val="20"/>
-          <w:szCs w:val="20"/>
-          <w:lang w:eastAsia="pl-PL"/>
-        </w:rPr>
-      </w:r>
-    </w:p>
-    <w:p>
-      <w:pPr>
-        <w:spacing w:before="120" w:after="0" w:line="360" w:lineRule="auto"/>
-        <w:jc w:val="right"/>
-        <w:rPr>
-          <w:rFonts w:ascii="Times New Roman" w:eastAsia="Times New Roman" w:hAnsi="Times New Roman"/>
-          <w:color w:val="0E0E0E"/>
-          <w:sz w:val="20"/>
-          <w:szCs w:val="20"/>
-          <w:lang w:eastAsia="pl-PL"/>
-        </w:rPr>
-      </w:pPr>
-      <w:r>
-        <w:rPr>
-          <w:rFonts w:ascii="Times New Roman" w:eastAsia="Times New Roman" w:hAnsi="Times New Roman"/>
-          <w:b/>
-          <w:color w:val="0E0E0E"/>
-          <w:sz w:val="20"/>
-          <w:szCs w:val="20"/>
-          <w:lang w:eastAsia="pl-PL"/>
-        </w:rPr>
-        <w:t xml:space="preserve">RAZEM: </w:t>
-      </w:r>
-      <w:r>
-        <w:rPr>
-          <w:rFonts w:ascii="Times New Roman" w:eastAsia="Times New Roman" w:hAnsi="Times New Roman"/>
-          <w:b/>
-          <w:color w:val="0E0E0E"/>
-          <w:sz w:val="20"/>
-          <w:szCs w:val="20"/>
-          <w:lang w:eastAsia="pl-PL"/>
-        </w:rPr>
-        <w:t>{{potracenie_2}} zł</w:t>
-      </w:r>
-      <w:r>
-        <w:rPr>
-          <w:rFonts w:ascii="Times New Roman" w:eastAsia="Times New Roman" w:hAnsi="Times New Roman"/>
-          <w:color w:val="0E0E0E"/>
-          <w:sz w:val="20"/>
-          <w:szCs w:val="20"/>
-          <w:lang w:eastAsia="pl-PL"/>
-        </w:rPr>
-      </w:r>
-      <w:r>
-        <w:rPr>
-          <w:rFonts w:ascii="Times New Roman" w:eastAsia="Times New Roman" w:hAnsi="Times New Roman"/>
-          <w:color w:val="0E0E0E"/>
-          <w:sz w:val="20"/>
-          <w:szCs w:val="20"/>
-          <w:lang w:eastAsia="pl-PL"/>
-        </w:rPr>
-      </w:r>
-      <w:r>
-        <w:rPr>
-          <w:rFonts w:ascii="Times New Roman" w:eastAsia="Times New Roman" w:hAnsi="Times New Roman"/>
-          <w:color w:val="0E0E0E"/>
-          <w:sz w:val="20"/>
-          <w:szCs w:val="20"/>
-          <w:lang w:eastAsia="pl-PL"/>
-        </w:rPr>
-      </w:r>
-      <w:r>
-        <w:rPr>
-          <w:rFonts w:ascii="Times New Roman" w:eastAsia="Times New Roman" w:hAnsi="Times New Roman"/>
-          <w:color w:val="0E0E0E"/>
-          <w:sz w:val="20"/>
-          <w:szCs w:val="20"/>
-          <w:lang w:eastAsia="pl-PL"/>
-        </w:rPr>
-      </w:r>
-    </w:p>
-    <w:p>
-      <w:pPr>
-        <w:spacing w:after="0" w:line="360" w:lineRule="auto"/>
-        <w:jc w:val="right"/>
-        <w:rPr>
-          <w:rFonts w:ascii="Times New Roman" w:eastAsia="Times New Roman" w:hAnsi="Times New Roman"/>
-          <w:color w:val="0E0E0E"/>
-          <w:sz w:val="20"/>
-          <w:szCs w:val="20"/>
-          <w:lang w:eastAsia="pl-PL"/>
-        </w:rPr>
-      </w:pPr>
-      <w:r>
-        <w:rPr>
-          <w:rFonts w:ascii="Times New Roman" w:eastAsia="Times New Roman" w:hAnsi="Times New Roman"/>
-          <w:b/>
-          <w:color w:val="0E0E0E"/>
-          <w:sz w:val="20"/>
-          <w:szCs w:val="20"/>
-          <w:lang w:eastAsia="pl-PL"/>
-        </w:rPr>
-        <w:t xml:space="preserve">RYCZAŁT DO WYPŁATY: </w:t>
-      </w:r>
-      <w:r>
-        <w:rPr>
-          <w:rFonts w:ascii="Times New Roman" w:eastAsia="Times New Roman" w:hAnsi="Times New Roman"/>
-          <w:color w:val="0E0E0E"/>
-          <w:sz w:val="20"/>
-          <w:szCs w:val="20"/>
-          <w:lang w:eastAsia="pl-PL"/>
-        </w:rPr>
-        <w:t>{{ryczalt_do_wyplaty_2}} zł</w:t>
-      </w:r>
-      <w:r>
-        <w:rPr>
-          <w:rFonts w:ascii="Times New Roman" w:eastAsia="Times New Roman" w:hAnsi="Times New Roman"/>
-          <w:color w:val="0E0E0E"/>
-          <w:sz w:val="20"/>
-          <w:szCs w:val="20"/>
-          <w:lang w:eastAsia="pl-PL"/>
-        </w:rPr>
-      </w:r>
-    </w:p>
-    <w:p>
-      <w:pPr>
-        <w:spacing w:after="120" w:line="360" w:lineRule="auto"/>
-        <w:jc w:val="right"/>
-        <w:rPr>
-          <w:rFonts w:ascii="Times New Roman" w:eastAsia="Times New Roman" w:hAnsi="Times New Roman"/>
-          <w:color w:val="0E0E0E"/>
-          <w:sz w:val="20"/>
-          <w:szCs w:val="20"/>
-          <w:lang w:eastAsia="pl-PL"/>
-        </w:rPr>
-      </w:pPr>
-      <w:r>
-        <w:rPr>
-          <w:rFonts w:ascii="Times New Roman" w:eastAsia="Times New Roman" w:hAnsi="Times New Roman"/>
-          <w:b/>
-          <w:color w:val="0E0E0E"/>
-          <w:sz w:val="20"/>
-          <w:szCs w:val="20"/>
-          <w:lang w:eastAsia="pl-PL"/>
-        </w:rPr>
-        <w:t xml:space="preserve">Proszę o wypłacenie należności: </w:t>
-      </w:r>
-      <w:r>
-        <w:rPr>
-          <w:rFonts w:ascii="Times New Roman" w:eastAsia="Times New Roman" w:hAnsi="Times New Roman"/>
-          <w:color w:val="0E0E0E"/>
-          <w:sz w:val="20"/>
-          <w:szCs w:val="20"/>
-          <w:lang w:eastAsia="pl-PL"/>
-        </w:rPr>
-        <w:t>{{ryczalt_do_wyplaty_2}} zł</w:t>
-      </w:r>
-      <w:r>
-        <w:rPr>
-          <w:rFonts w:ascii="Times New Roman" w:eastAsia="Times New Roman" w:hAnsi="Times New Roman"/>
-          <w:color w:val="0E0E0E"/>
-          <w:sz w:val="20"/>
-          <w:szCs w:val="20"/>
-          <w:lang w:eastAsia="pl-PL"/>
-        </w:rPr>
-      </w:r>
-    </w:p>
-    <w:p>
-      <w:pPr>
-        <w:spacing w:after="120" w:line="240" w:lineRule="auto"/>
-        <w:jc w:val="right"/>
-        <w:rPr>
-          <w:rFonts w:ascii="Times New Roman" w:eastAsia="Times New Roman" w:hAnsi="Times New Roman"/>
-          <w:color w:val="0E0E0E"/>
-          <w:sz w:val="18"/>
-          <w:szCs w:val="18"/>
-          <w:lang w:eastAsia="pl-PL"/>
-        </w:rPr>
-      </w:pPr>
-      <w:r>
-        <w:rPr>
-          <w:rFonts w:ascii="Times New Roman" w:eastAsia="Times New Roman" w:hAnsi="Times New Roman"/>
-          <w:color w:val="0E0E0E"/>
-          <w:sz w:val="18"/>
-          <w:szCs w:val="18"/>
-          <w:lang w:eastAsia="pl-PL"/>
-        </w:rPr>
-        <w:t>Kwituję odbiór kwoty: {{ryczalt_do_wyplaty_2}} zł</w:t>
-      </w:r>
-      <w:r>
-        <w:rPr>
-          <w:rFonts w:ascii="Times New Roman" w:eastAsia="Times New Roman" w:hAnsi="Times New Roman"/>
-          <w:color w:val="0E0E0E"/>
-          <w:sz w:val="18"/>
-          <w:szCs w:val="18"/>
-          <w:lang w:eastAsia="pl-PL"/>
-        </w:rPr>
-      </w:r>
-      <w:r>
-        <w:rPr>
-          <w:rFonts w:ascii="Times New Roman" w:eastAsia="Times New Roman" w:hAnsi="Times New Roman"/>
-          <w:color w:val="0E0E0E"/>
-          <w:sz w:val="18"/>
-          <w:szCs w:val="18"/>
-          <w:lang w:eastAsia="pl-PL"/>
-        </w:rPr>
-      </w:r>
-    </w:p>
-    <w:p>
-      <w:pPr>
-        <w:spacing w:after="120" w:line="240" w:lineRule="auto"/>
-        <w:jc w:val="right"/>
-        <w:rPr>
-          <w:rFonts w:ascii="Times New Roman" w:eastAsia="Times New Roman" w:hAnsi="Times New Roman"/>
-          <w:color w:val="0E0E0E"/>
-          <w:sz w:val="18"/>
-          <w:szCs w:val="18"/>
-          <w:lang w:eastAsia="pl-PL"/>
-        </w:rPr>
-      </w:pPr>
-      <w:r>
-        <w:rPr>
-          <w:rFonts w:ascii="Times New Roman" w:eastAsia="Times New Roman" w:hAnsi="Times New Roman"/>
-          <w:color w:val="0E0E0E"/>
-          <w:sz w:val="18"/>
-          <w:szCs w:val="18"/>
-          <w:lang w:eastAsia="pl-PL"/>
-        </w:rPr>
-        <w:t>słownie: {{kwota_slownie_2}}</w:t>
-      </w:r>
-      <w:r>
-        <w:rPr>
-          <w:rFonts w:ascii="Times New Roman" w:eastAsia="Times New Roman" w:hAnsi="Times New Roman"/>
-          <w:color w:val="0E0E0E"/>
-          <w:sz w:val="18"/>
-          <w:szCs w:val="18"/>
-          <w:lang w:eastAsia="pl-PL"/>
-        </w:rPr>
-      </w:r>
-    </w:p>
-    <w:p>
-      <w:pPr>
-        <w:spacing w:after="120" w:line="240" w:lineRule="auto"/>
-        <w:jc w:val="right"/>
-        <w:rPr>
-          <w:rFonts w:ascii="Times New Roman" w:eastAsia="Times New Roman" w:hAnsi="Times New Roman"/>
-          <w:color w:val="0E0E0E"/>
-          <w:sz w:val="18"/>
-          <w:szCs w:val="18"/>
-          <w:lang w:eastAsia="pl-PL"/>
-        </w:rPr>
-      </w:pPr>
-      <w:r>
-        <w:rPr>
-          <w:rFonts w:ascii="Times New Roman" w:eastAsia="Times New Roman" w:hAnsi="Times New Roman"/>
-          <w:color w:val="0E0E0E"/>
-          <w:sz w:val="18"/>
-          <w:szCs w:val="18"/>
-          <w:lang w:eastAsia="pl-PL"/>
-        </w:rPr>
-      </w:r>
-    </w:p>
-    <w:p>
-      <w:pPr>
-        <w:spacing w:after="120" w:line="240" w:lineRule="auto"/>
-        <w:jc w:val="right"/>
-        <w:rPr>
-          <w:rFonts w:ascii="Times New Roman" w:eastAsia="Times New Roman" w:hAnsi="Times New Roman"/>
-          <w:color w:val="0E0E0E"/>
-          <w:sz w:val="18"/>
-          <w:szCs w:val="18"/>
-          <w:lang w:eastAsia="pl-PL"/>
-        </w:rPr>
-      </w:pPr>
-      <w:r>
-        <w:rPr>
-          <w:rFonts w:ascii="Times New Roman" w:eastAsia="Times New Roman" w:hAnsi="Times New Roman"/>
-          <w:color w:val="0E0E0E"/>
-          <w:sz w:val="18"/>
-          <w:szCs w:val="18"/>
-          <w:lang w:eastAsia="pl-PL"/>
-        </w:rPr>
-      </w:r>
-    </w:p>
-    <w:p>
-      <w:pPr>
-        <w:spacing w:after="0" w:line="240" w:lineRule="auto"/>
-        <w:rPr>
-          <w:rFonts w:ascii="Times New Roman" w:eastAsia="Times New Roman" w:hAnsi="Times New Roman"/>
-          <w:color w:val="0E0E0E"/>
-          <w:sz w:val="18"/>
-          <w:szCs w:val="18"/>
-          <w:lang w:eastAsia="pl-PL"/>
-        </w:rPr>
-      </w:pPr>
-      <w:r>
-        <w:rPr>
-          <w:rFonts w:ascii="Times New Roman" w:eastAsia="Times New Roman" w:hAnsi="Times New Roman"/>
-          <w:color w:val="0E0E0E"/>
-          <w:sz w:val="18"/>
-          <w:szCs w:val="18"/>
-          <w:lang w:eastAsia="pl-PL"/>
-        </w:rPr>
-        <w:t>……………</w:t>
-      </w:r>
-      <w:r>
-        <w:rPr>
-          <w:rFonts w:ascii="Times New Roman" w:eastAsia="Times New Roman" w:hAnsi="Times New Roman"/>
-          <w:color w:val="0E0E0E"/>
-          <w:sz w:val="18"/>
-          <w:szCs w:val="18"/>
-          <w:lang w:eastAsia="pl-PL"/>
-        </w:rPr>
-        <w:t>…………</w:t>
-      </w:r>
-      <w:r>
-        <w:rPr>
-          <w:rFonts w:ascii="Times New Roman" w:eastAsia="Times New Roman" w:hAnsi="Times New Roman"/>
-          <w:color w:val="0E0E0E"/>
-          <w:sz w:val="18"/>
-          <w:szCs w:val="18"/>
-          <w:lang w:eastAsia="pl-PL"/>
-        </w:rPr>
-        <w:t>……….</w:t>
-      </w:r>
-    </w:p>
-    <w:p>
-      <w:pPr>
-        <w:spacing w:after="0" w:line="240" w:lineRule="auto"/>
-        <w:rPr>
-          <w:rFonts w:ascii="Times New Roman" w:eastAsia="Times New Roman" w:hAnsi="Times New Roman"/>
-          <w:color w:val="0E0E0E"/>
-          <w:sz w:val="16"/>
-          <w:szCs w:val="16"/>
-          <w:lang w:eastAsia="pl-PL"/>
-        </w:rPr>
-      </w:pPr>
-      <w:r>
-        <w:rPr>
-          <w:rFonts w:ascii="Times New Roman" w:eastAsia="Times New Roman" w:hAnsi="Times New Roman"/>
-          <w:color w:val="0E0E0E"/>
-          <w:sz w:val="16"/>
-          <w:szCs w:val="16"/>
-          <w:lang w:eastAsia="pl-PL"/>
-        </w:rPr>
-        <w:t xml:space="preserve">          </w:t>
-      </w:r>
-      <w:r>
-        <w:rPr>
-          <w:rFonts w:ascii="Times New Roman" w:eastAsia="Times New Roman" w:hAnsi="Times New Roman"/>
-          <w:color w:val="0E0E0E"/>
-          <w:sz w:val="16"/>
-          <w:szCs w:val="16"/>
-          <w:lang w:eastAsia="pl-PL"/>
-        </w:rPr>
-        <w:t>(podpis rozliczającego)</w:t>
-      </w:r>
-    </w:p>
-    <w:p>
-      <w:pPr>
-        <w:spacing w:after="0" w:line="240" w:lineRule="auto"/>
-        <w:rPr>
-          <w:rFonts w:ascii="Times New Roman" w:eastAsia="Times New Roman" w:hAnsi="Times New Roman"/>
-          <w:color w:val="0E0E0E"/>
-          <w:sz w:val="16"/>
-          <w:szCs w:val="16"/>
-          <w:lang w:eastAsia="pl-PL"/>
-        </w:rPr>
-      </w:pPr>
-    </w:p>
-    <w:p>
-      <w:pPr>
-        <w:spacing w:after="0" w:line="240" w:lineRule="auto"/>
-        <w:rPr>
-          <w:rFonts w:ascii="Times New Roman" w:eastAsia="Times New Roman" w:hAnsi="Times New Roman"/>
-          <w:color w:val="0E0E0E"/>
-          <w:sz w:val="16"/>
-          <w:szCs w:val="16"/>
-          <w:lang w:eastAsia="pl-PL"/>
-        </w:rPr>
-      </w:pPr>
-    </w:p>
-    <w:p>
-      <w:pPr>
-        <w:spacing w:after="0" w:line="240" w:lineRule="auto"/>
-        <w:rPr>
-          <w:rFonts w:ascii="Times New Roman" w:eastAsia="Times New Roman" w:hAnsi="Times New Roman"/>
-          <w:color w:val="0E0E0E"/>
-          <w:sz w:val="16"/>
-          <w:szCs w:val="16"/>
-          <w:lang w:eastAsia="pl-PL"/>
-        </w:rPr>
-      </w:pPr>
-    </w:p>
-    <w:p>
-      <w:pPr>
-        <w:spacing w:after="0" w:line="240" w:lineRule="auto"/>
-        <w:jc w:val="right"/>
-        <w:rPr>
-          <w:rFonts w:ascii="Times New Roman" w:eastAsia="Times New Roman" w:hAnsi="Times New Roman"/>
-          <w:color w:val="0E0E0E"/>
-          <w:sz w:val="20"/>
-          <w:szCs w:val="20"/>
-          <w:lang w:eastAsia="pl-PL"/>
-        </w:rPr>
-      </w:pPr>
-      <w:r>
-        <w:rPr>
-          <w:rFonts w:ascii="Times New Roman" w:eastAsia="Times New Roman" w:hAnsi="Times New Roman"/>
-          <w:color w:val="0E0E0E"/>
-          <w:sz w:val="20"/>
-          <w:szCs w:val="20"/>
-          <w:lang w:eastAsia="pl-PL"/>
-        </w:rPr>
-        <w:t>{{data_wystawienia_2}}</w:t>
-        <w:tab/>
-        <w:tab/>
-        <w:tab/>
-        <w:t>…..………………..</w:t>
-      </w:r>
-      <w:r>
-        <w:rPr>
-          <w:rFonts w:ascii="Times New Roman" w:eastAsia="Times New Roman" w:hAnsi="Times New Roman"/>
-          <w:color w:val="0E0E0E"/>
-          <w:sz w:val="20"/>
-          <w:szCs w:val="20"/>
-          <w:lang w:eastAsia="pl-PL"/>
-        </w:rPr>
-      </w:r>
-      <w:r>
-        <w:rPr>
-          <w:rFonts w:ascii="Times New Roman" w:eastAsia="Times New Roman" w:hAnsi="Times New Roman"/>
-          <w:color w:val="0E0E0E"/>
-          <w:sz w:val="20"/>
-          <w:szCs w:val="20"/>
-          <w:lang w:eastAsia="pl-PL"/>
-        </w:rPr>
-      </w:r>
-      <w:r>
-        <w:rPr>
-          <w:rFonts w:ascii="Times New Roman" w:eastAsia="Times New Roman" w:hAnsi="Times New Roman"/>
-          <w:color w:val="0E0E0E"/>
-          <w:sz w:val="20"/>
-          <w:szCs w:val="20"/>
-          <w:lang w:eastAsia="pl-PL"/>
-        </w:rPr>
-      </w:r>
-      <w:r>
-        <w:rPr>
-          <w:rFonts w:ascii="Times New Roman" w:eastAsia="Times New Roman" w:hAnsi="Times New Roman"/>
-          <w:color w:val="0E0E0E"/>
-          <w:sz w:val="20"/>
-          <w:szCs w:val="20"/>
-          <w:lang w:eastAsia="pl-PL"/>
-        </w:rPr>
-      </w:r>
-      <w:r>
-        <w:rPr>
-          <w:rFonts w:ascii="Times New Roman" w:eastAsia="Times New Roman" w:hAnsi="Times New Roman"/>
-          <w:color w:val="0E0E0E"/>
-          <w:sz w:val="20"/>
-          <w:szCs w:val="20"/>
-          <w:lang w:eastAsia="pl-PL"/>
-        </w:rPr>
-      </w:r>
-      <w:r>
-        <w:rPr>
-          <w:rFonts w:ascii="Times New Roman" w:eastAsia="Times New Roman" w:hAnsi="Times New Roman"/>
-          <w:color w:val="0E0E0E"/>
-          <w:sz w:val="20"/>
-          <w:szCs w:val="20"/>
-          <w:lang w:eastAsia="pl-PL"/>
-        </w:rPr>
-      </w:r>
-    </w:p>
-    <w:p>
-      <w:pPr>
-        <w:spacing w:after="0" w:line="240" w:lineRule="auto"/>
-        <w:ind w:left="2268"/>
-        <w:jc w:val="center"/>
-        <w:rPr>
-          <w:rFonts w:ascii="Times New Roman" w:eastAsia="Times New Roman" w:hAnsi="Times New Roman"/>
-          <w:color w:val="0E0E0E"/>
-          <w:sz w:val="16"/>
-          <w:szCs w:val="16"/>
-          <w:lang w:eastAsia="pl-PL"/>
-        </w:rPr>
-      </w:pPr>
-      <w:r>
-        <w:rPr>
-          <w:rFonts w:ascii="Times New Roman" w:eastAsia="Times New Roman" w:hAnsi="Times New Roman"/>
-          <w:color w:val="0E0E0E"/>
-          <w:sz w:val="16"/>
-          <w:szCs w:val="16"/>
-          <w:lang w:eastAsia="pl-PL"/>
-        </w:rPr>
-        <w:t>(</w:t>
-      </w:r>
-      <w:r>
-        <w:rPr>
-          <w:rFonts w:ascii="Times New Roman" w:eastAsia="Times New Roman" w:hAnsi="Times New Roman"/>
-          <w:color w:val="0E0E0E"/>
-          <w:sz w:val="16"/>
-          <w:szCs w:val="16"/>
-          <w:lang w:eastAsia="pl-PL"/>
-        </w:rPr>
-        <w:t>data</w:t>
-      </w:r>
-      <w:r>
-        <w:rPr>
-          <w:rFonts w:ascii="Times New Roman" w:eastAsia="Times New Roman" w:hAnsi="Times New Roman"/>
-          <w:color w:val="0E0E0E"/>
-          <w:sz w:val="16"/>
-          <w:szCs w:val="16"/>
-          <w:lang w:eastAsia="pl-PL"/>
-        </w:rPr>
-        <w:t>)</w:t>
-      </w:r>
-      <w:r>
-        <w:rPr>
-          <w:rFonts w:ascii="Times New Roman" w:eastAsia="Times New Roman" w:hAnsi="Times New Roman"/>
-          <w:color w:val="0E0E0E"/>
-          <w:sz w:val="24"/>
-          <w:szCs w:val="24"/>
-          <w:lang w:eastAsia="pl-PL"/>
-        </w:rPr>
-        <w:tab/>
-      </w:r>
-      <w:r>
-        <w:rPr>
-          <w:rFonts w:ascii="Times New Roman" w:eastAsia="Times New Roman" w:hAnsi="Times New Roman"/>
-          <w:color w:val="0E0E0E"/>
-          <w:sz w:val="24"/>
-          <w:szCs w:val="24"/>
-          <w:lang w:eastAsia="pl-PL"/>
-        </w:rPr>
-        <w:tab/>
-      </w:r>
-      <w:r>
-        <w:rPr>
-          <w:rFonts w:ascii="Times New Roman" w:eastAsia="Times New Roman" w:hAnsi="Times New Roman"/>
-          <w:color w:val="0E0E0E"/>
-          <w:sz w:val="24"/>
-          <w:szCs w:val="24"/>
-          <w:lang w:eastAsia="pl-PL"/>
-        </w:rPr>
-        <w:tab/>
-      </w:r>
-      <w:r>
-        <w:rPr>
-          <w:rFonts w:ascii="Times New Roman" w:eastAsia="Times New Roman" w:hAnsi="Times New Roman"/>
-          <w:color w:val="0E0E0E"/>
-          <w:sz w:val="24"/>
-          <w:szCs w:val="24"/>
-          <w:lang w:eastAsia="pl-PL"/>
-        </w:rPr>
-        <w:tab/>
-      </w:r>
-      <w:r>
-        <w:rPr>
-          <w:rFonts w:ascii="Times New Roman" w:eastAsia="Times New Roman" w:hAnsi="Times New Roman"/>
-          <w:color w:val="0E0E0E"/>
-          <w:sz w:val="16"/>
-          <w:szCs w:val="16"/>
-          <w:lang w:eastAsia="pl-PL"/>
-        </w:rPr>
-        <w:t>(</w:t>
-      </w:r>
-      <w:r>
-        <w:rPr>
-          <w:rFonts w:ascii="Times New Roman" w:eastAsia="Times New Roman" w:hAnsi="Times New Roman"/>
-          <w:color w:val="0E0E0E"/>
-          <w:sz w:val="16"/>
-          <w:szCs w:val="16"/>
-          <w:lang w:eastAsia="pl-PL"/>
-        </w:rPr>
-        <w:t>podpis</w:t>
-      </w:r>
-      <w:r>
-        <w:rPr>
-          <w:rFonts w:ascii="Times New Roman" w:eastAsia="Times New Roman" w:hAnsi="Times New Roman"/>
-          <w:color w:val="0E0E0E"/>
-          <w:sz w:val="16"/>
-          <w:szCs w:val="16"/>
-          <w:lang w:eastAsia="pl-PL"/>
-        </w:rPr>
-        <w:t>)</w:t>
-      </w:r>
-    </w:p>
   </w:body>
 </w:document>
 </file>

</xml_diff>

<commit_message>
fix: rebuild masters with XML-level tag fixes (no run restructuring)
Typo fixes and _2 suffixes applied at XML string level to preserve
exact run formatting from user's template.

Co-Authored-By: Claude Opus 4.6 (1M context) <noreply@anthropic.com>
</commit_message>
<xml_diff>
--- a/mbr/templates/paliwo_master_2.docx
+++ b/mbr/templates/paliwo_master_2.docx
@@ -1978,7 +1978,7 @@
           <w:szCs w:val="24"/>
           <w:lang w:eastAsia="pl-PL"/>
         </w:rPr>
-        <w:t xml:space="preserve">   {{imie_nazwisko_2}}                                {{data_wystawienia_2}}</w:t>
+        <w:t xml:space="preserve">   {{imie_nazwisko}}                                {{data_wystawienia}}</w:t>
       </w:r>
     </w:p>
     <w:p>
@@ -2047,7 +2047,7 @@
           <w:szCs w:val="24"/>
           <w:lang w:eastAsia="pl-PL"/>
         </w:rPr>
-        <w:t xml:space="preserve">   {{stanowisko_2}}</w:t>
+        <w:t xml:space="preserve">   {{stanowisko}}</w:t>
       </w:r>
     </w:p>
     <w:p>

</xml_diff>